<commit_message>
#work till 30 sept
</commit_message>
<xml_diff>
--- a/prp/ip data/strategy/Strategy-IP.docx
+++ b/prp/ip data/strategy/Strategy-IP.docx
@@ -1,6 +1,6 @@
 
 <file path=word/document.xml><?xml version="1.0" encoding="utf-8"?>
-<w:document xmlns:wpc="http://schemas.microsoft.com/office/word/2010/wordprocessingCanvas" xmlns:mc="http://schemas.openxmlformats.org/markup-compatibility/2006" xmlns:o="urn:schemas-microsoft-com:office:office" xmlns:r="http://schemas.openxmlformats.org/officeDocument/2006/relationships" xmlns:m="http://schemas.openxmlformats.org/officeDocument/2006/math" xmlns:v="urn:schemas-microsoft-com:vml" xmlns:wp14="http://schemas.microsoft.com/office/word/2010/wordprocessingDrawing" xmlns:wp="http://schemas.openxmlformats.org/drawingml/2006/wordprocessingDrawing" xmlns:w10="urn:schemas-microsoft-com:office:word" xmlns:w="http://schemas.openxmlformats.org/wordprocessingml/2006/main" xmlns:w14="http://schemas.microsoft.com/office/word/2010/wordml" xmlns:w15="http://schemas.microsoft.com/office/word/2012/wordml" xmlns:wpg="http://schemas.microsoft.com/office/word/2010/wordprocessingGroup" xmlns:wpi="http://schemas.microsoft.com/office/word/2010/wordprocessingInk" xmlns:wne="http://schemas.microsoft.com/office/word/2006/wordml" xmlns:wps="http://schemas.microsoft.com/office/word/2010/wordprocessingShape" mc:Ignorable="w14 w15 wp14">
+<w:document xmlns:wpc="http://schemas.microsoft.com/office/word/2010/wordprocessingCanvas" xmlns:cx="http://schemas.microsoft.com/office/drawing/2014/chartex" xmlns:cx1="http://schemas.microsoft.com/office/drawing/2015/9/8/chartex" xmlns:cx2="http://schemas.microsoft.com/office/drawing/2015/10/21/chartex" xmlns:cx3="http://schemas.microsoft.com/office/drawing/2016/5/9/chartex" xmlns:cx4="http://schemas.microsoft.com/office/drawing/2016/5/10/chartex" xmlns:cx5="http://schemas.microsoft.com/office/drawing/2016/5/11/chartex" xmlns:cx6="http://schemas.microsoft.com/office/drawing/2016/5/12/chartex" xmlns:cx7="http://schemas.microsoft.com/office/drawing/2016/5/13/chartex" xmlns:cx8="http://schemas.microsoft.com/office/drawing/2016/5/14/chartex" xmlns:mc="http://schemas.openxmlformats.org/markup-compatibility/2006" xmlns:aink="http://schemas.microsoft.com/office/drawing/2016/ink" xmlns:am3d="http://schemas.microsoft.com/office/drawing/2017/model3d" xmlns:o="urn:schemas-microsoft-com:office:office" xmlns:r="http://schemas.openxmlformats.org/officeDocument/2006/relationships" xmlns:m="http://schemas.openxmlformats.org/officeDocument/2006/math" xmlns:v="urn:schemas-microsoft-com:vml" xmlns:wp14="http://schemas.microsoft.com/office/word/2010/wordprocessingDrawing" xmlns:wp="http://schemas.openxmlformats.org/drawingml/2006/wordprocessingDrawing" xmlns:w10="urn:schemas-microsoft-com:office:word" xmlns:w="http://schemas.openxmlformats.org/wordprocessingml/2006/main" xmlns:w14="http://schemas.microsoft.com/office/word/2010/wordml" xmlns:w15="http://schemas.microsoft.com/office/word/2012/wordml" xmlns:w16cex="http://schemas.microsoft.com/office/word/2018/wordml/cex" xmlns:w16cid="http://schemas.microsoft.com/office/word/2016/wordml/cid" xmlns:w16="http://schemas.microsoft.com/office/word/2018/wordml" xmlns:w16sdtdh="http://schemas.microsoft.com/office/word/2020/wordml/sdtdatahash" xmlns:w16se="http://schemas.microsoft.com/office/word/2015/wordml/symex" xmlns:wpg="http://schemas.microsoft.com/office/word/2010/wordprocessingGroup" xmlns:wpi="http://schemas.microsoft.com/office/word/2010/wordprocessingInk" xmlns:wne="http://schemas.microsoft.com/office/word/2006/wordml" xmlns:wps="http://schemas.microsoft.com/office/word/2010/wordprocessingShape" mc:Ignorable="w14 w15 w16se w16cid w16 w16cex w16sdtdh wp14">
   <w:body>
     <w:tbl>
       <w:tblPr>
@@ -353,19 +353,8 @@
                 <w:szCs w:val="24"/>
                 <w:lang w:eastAsia="en-IN"/>
               </w:rPr>
-              <w:t xml:space="preserve">MySQL + </w:t>
-            </w:r>
-            <w:proofErr w:type="spellStart"/>
-            <w:r>
-              <w:rPr>
-                <w:rFonts w:ascii="Times New Roman" w:eastAsia="Times New Roman" w:hAnsi="Times New Roman" w:cs="Times New Roman"/>
-                <w:sz w:val="24"/>
-                <w:szCs w:val="24"/>
-                <w:lang w:eastAsia="en-IN"/>
-              </w:rPr>
-              <w:t>MongoDB</w:t>
-            </w:r>
-            <w:proofErr w:type="spellEnd"/>
+              <w:t>MySQL + MongoDB</w:t>
+            </w:r>
           </w:p>
         </w:tc>
         <w:tc>
@@ -895,7 +884,7 @@
           <w:szCs w:val="24"/>
           <w:lang w:eastAsia="en-IN"/>
         </w:rPr>
-        <w:pict>
+        <w:pict w14:anchorId="5CBE9392">
           <v:rect id="_x0000_i1025" style="width:0;height:1.5pt" o:hralign="center" o:hrstd="t" o:hr="t" fillcolor="#a0a0a0" stroked="f"/>
         </w:pict>
       </w:r>
@@ -1069,27 +1058,7 @@
                 <w:szCs w:val="24"/>
                 <w:lang w:eastAsia="en-IN"/>
               </w:rPr>
-              <w:t xml:space="preserve">OOP, Object class, String vs </w:t>
-            </w:r>
-            <w:proofErr w:type="spellStart"/>
-            <w:r>
-              <w:rPr>
-                <w:rFonts w:ascii="Times New Roman" w:eastAsia="Times New Roman" w:hAnsi="Times New Roman" w:cs="Times New Roman"/>
-                <w:sz w:val="24"/>
-                <w:szCs w:val="24"/>
-                <w:lang w:eastAsia="en-IN"/>
-              </w:rPr>
-              <w:t>StringBuilder</w:t>
-            </w:r>
-            <w:proofErr w:type="spellEnd"/>
-            <w:r>
-              <w:rPr>
-                <w:rFonts w:ascii="Times New Roman" w:eastAsia="Times New Roman" w:hAnsi="Times New Roman" w:cs="Times New Roman"/>
-                <w:sz w:val="24"/>
-                <w:szCs w:val="24"/>
-                <w:lang w:eastAsia="en-IN"/>
-              </w:rPr>
-              <w:t xml:space="preserve"> vs </w:t>
+              <w:t xml:space="preserve">OOP, Object class, String vs StringBuilder vs </w:t>
             </w:r>
             <w:proofErr w:type="spellStart"/>
             <w:r>
@@ -1190,27 +1159,7 @@
                 <w:szCs w:val="24"/>
                 <w:lang w:eastAsia="en-IN"/>
               </w:rPr>
-              <w:t xml:space="preserve">Spring Architecture, </w:t>
-            </w:r>
-            <w:proofErr w:type="spellStart"/>
-            <w:r>
-              <w:rPr>
-                <w:rFonts w:ascii="Times New Roman" w:eastAsia="Times New Roman" w:hAnsi="Times New Roman" w:cs="Times New Roman"/>
-                <w:sz w:val="24"/>
-                <w:szCs w:val="24"/>
-                <w:lang w:eastAsia="en-IN"/>
-              </w:rPr>
-              <w:t>IoC</w:t>
-            </w:r>
-            <w:proofErr w:type="spellEnd"/>
-            <w:r>
-              <w:rPr>
-                <w:rFonts w:ascii="Times New Roman" w:eastAsia="Times New Roman" w:hAnsi="Times New Roman" w:cs="Times New Roman"/>
-                <w:sz w:val="24"/>
-                <w:szCs w:val="24"/>
-                <w:lang w:eastAsia="en-IN"/>
-              </w:rPr>
-              <w:t>, DI, Bean Lifecycle, @Component, @Service, @Repository</w:t>
+              <w:t>Spring Architecture, IoC, DI, Bean Lifecycle, @Component, @Service, @Repository</w:t>
             </w:r>
           </w:p>
         </w:tc>
@@ -1244,21 +1193,8 @@
                 <w:szCs w:val="24"/>
                 <w:lang w:eastAsia="en-IN"/>
               </w:rPr>
-              <w:t xml:space="preserve">Wednesday – MySQL + </w:t>
-            </w:r>
-            <w:proofErr w:type="spellStart"/>
-            <w:r>
-              <w:rPr>
-                <w:rFonts w:ascii="Times New Roman" w:eastAsia="Times New Roman" w:hAnsi="Times New Roman" w:cs="Times New Roman"/>
-                <w:b/>
-                <w:bCs/>
-                <w:sz w:val="24"/>
-                <w:szCs w:val="24"/>
-                <w:lang w:eastAsia="en-IN"/>
-              </w:rPr>
-              <w:t>MongoDB</w:t>
-            </w:r>
-            <w:proofErr w:type="spellEnd"/>
+              <w:t>Wednesday – MySQL + MongoDB</w:t>
+            </w:r>
           </w:p>
         </w:tc>
         <w:tc>
@@ -1284,27 +1220,7 @@
                 <w:szCs w:val="24"/>
                 <w:lang w:eastAsia="en-IN"/>
               </w:rPr>
-              <w:t xml:space="preserve">SQL Basics, Primary/Foreign Key, Normalization, CRUD, </w:t>
-            </w:r>
-            <w:proofErr w:type="spellStart"/>
-            <w:r>
-              <w:rPr>
-                <w:rFonts w:ascii="Times New Roman" w:eastAsia="Times New Roman" w:hAnsi="Times New Roman" w:cs="Times New Roman"/>
-                <w:sz w:val="24"/>
-                <w:szCs w:val="24"/>
-                <w:lang w:eastAsia="en-IN"/>
-              </w:rPr>
-              <w:t>MongoDB</w:t>
-            </w:r>
-            <w:proofErr w:type="spellEnd"/>
-            <w:r>
-              <w:rPr>
-                <w:rFonts w:ascii="Times New Roman" w:eastAsia="Times New Roman" w:hAnsi="Times New Roman" w:cs="Times New Roman"/>
-                <w:sz w:val="24"/>
-                <w:szCs w:val="24"/>
-                <w:lang w:eastAsia="en-IN"/>
-              </w:rPr>
-              <w:t xml:space="preserve"> Documents &amp; Collections</w:t>
+              <w:t>SQL Basics, Primary/Foreign Key, Normalization, CRUD, MongoDB Documents &amp; Collections</w:t>
             </w:r>
           </w:p>
         </w:tc>
@@ -1358,25 +1274,14 @@
                 <w:lang w:eastAsia="en-IN"/>
               </w:rPr>
             </w:pPr>
-            <w:proofErr w:type="spellStart"/>
-            <w:r>
-              <w:rPr>
-                <w:rFonts w:ascii="Times New Roman" w:eastAsia="Times New Roman" w:hAnsi="Times New Roman" w:cs="Times New Roman"/>
-                <w:sz w:val="24"/>
-                <w:szCs w:val="24"/>
-                <w:lang w:eastAsia="en-IN"/>
-              </w:rPr>
-              <w:t>TypeScript</w:t>
-            </w:r>
-            <w:proofErr w:type="spellEnd"/>
-            <w:r>
-              <w:rPr>
-                <w:rFonts w:ascii="Times New Roman" w:eastAsia="Times New Roman" w:hAnsi="Times New Roman" w:cs="Times New Roman"/>
-                <w:sz w:val="24"/>
-                <w:szCs w:val="24"/>
-                <w:lang w:eastAsia="en-IN"/>
-              </w:rPr>
-              <w:t xml:space="preserve"> Basics, Components, Modules, Data Binding, Directives</w:t>
+            <w:r>
+              <w:rPr>
+                <w:rFonts w:ascii="Times New Roman" w:eastAsia="Times New Roman" w:hAnsi="Times New Roman" w:cs="Times New Roman"/>
+                <w:sz w:val="24"/>
+                <w:szCs w:val="24"/>
+                <w:lang w:eastAsia="en-IN"/>
+              </w:rPr>
+              <w:t>TypeScript Basics, Components, Modules, Data Binding, Directives</w:t>
             </w:r>
           </w:p>
         </w:tc>
@@ -1582,7 +1487,7 @@
           <w:szCs w:val="24"/>
           <w:lang w:eastAsia="en-IN"/>
         </w:rPr>
-        <w:pict>
+        <w:pict w14:anchorId="16303B0F">
           <v:rect id="_x0000_i1026" style="width:0;height:1.5pt" o:hralign="center" o:hrstd="t" o:hr="t" fillcolor="#a0a0a0" stroked="f"/>
         </w:pict>
       </w:r>
@@ -1628,8 +1533,8 @@
         <w:tblLook w:val="04A0" w:firstRow="1" w:lastRow="0" w:firstColumn="1" w:lastColumn="0" w:noHBand="0" w:noVBand="1"/>
       </w:tblPr>
       <w:tblGrid>
-        <w:gridCol w:w="2634"/>
-        <w:gridCol w:w="6392"/>
+        <w:gridCol w:w="3261"/>
+        <w:gridCol w:w="5765"/>
       </w:tblGrid>
       <w:tr>
         <w:trPr>
@@ -1638,7 +1543,7 @@
         </w:trPr>
         <w:tc>
           <w:tcPr>
-            <w:tcW w:w="0" w:type="auto"/>
+            <w:tcW w:w="3216" w:type="dxa"/>
             <w:vAlign w:val="center"/>
             <w:hideMark/>
           </w:tcPr>
@@ -1670,7 +1575,7 @@
         </w:tc>
         <w:tc>
           <w:tcPr>
-            <w:tcW w:w="0" w:type="auto"/>
+            <w:tcW w:w="5720" w:type="dxa"/>
             <w:vAlign w:val="center"/>
             <w:hideMark/>
           </w:tcPr>
@@ -1707,7 +1612,7 @@
         </w:trPr>
         <w:tc>
           <w:tcPr>
-            <w:tcW w:w="0" w:type="auto"/>
+            <w:tcW w:w="3216" w:type="dxa"/>
             <w:vAlign w:val="center"/>
             <w:hideMark/>
           </w:tcPr>
@@ -1736,7 +1641,7 @@
         </w:tc>
         <w:tc>
           <w:tcPr>
-            <w:tcW w:w="0" w:type="auto"/>
+            <w:tcW w:w="5720" w:type="dxa"/>
             <w:vAlign w:val="center"/>
             <w:hideMark/>
           </w:tcPr>
@@ -1757,27 +1662,7 @@
                 <w:szCs w:val="24"/>
                 <w:lang w:eastAsia="en-IN"/>
               </w:rPr>
-              <w:t xml:space="preserve">Collections Framework, </w:t>
-            </w:r>
-            <w:proofErr w:type="spellStart"/>
-            <w:r>
-              <w:rPr>
-                <w:rFonts w:ascii="Times New Roman" w:eastAsia="Times New Roman" w:hAnsi="Times New Roman" w:cs="Times New Roman"/>
-                <w:sz w:val="24"/>
-                <w:szCs w:val="24"/>
-                <w:lang w:eastAsia="en-IN"/>
-              </w:rPr>
-              <w:t>HashMap</w:t>
-            </w:r>
-            <w:proofErr w:type="spellEnd"/>
-            <w:r>
-              <w:rPr>
-                <w:rFonts w:ascii="Times New Roman" w:eastAsia="Times New Roman" w:hAnsi="Times New Roman" w:cs="Times New Roman"/>
-                <w:sz w:val="24"/>
-                <w:szCs w:val="24"/>
-                <w:lang w:eastAsia="en-IN"/>
-              </w:rPr>
-              <w:t xml:space="preserve"> Internals, </w:t>
+              <w:t xml:space="preserve">Collections Framework, HashMap Internals, </w:t>
             </w:r>
             <w:proofErr w:type="spellStart"/>
             <w:r>
@@ -1828,7 +1713,7 @@
         </w:trPr>
         <w:tc>
           <w:tcPr>
-            <w:tcW w:w="0" w:type="auto"/>
+            <w:tcW w:w="3216" w:type="dxa"/>
             <w:vAlign w:val="center"/>
             <w:hideMark/>
           </w:tcPr>
@@ -1857,7 +1742,7 @@
         </w:tc>
         <w:tc>
           <w:tcPr>
-            <w:tcW w:w="0" w:type="auto"/>
+            <w:tcW w:w="5720" w:type="dxa"/>
             <w:vAlign w:val="center"/>
             <w:hideMark/>
           </w:tcPr>
@@ -1878,27 +1763,7 @@
                 <w:szCs w:val="24"/>
                 <w:lang w:eastAsia="en-IN"/>
               </w:rPr>
-              <w:t>@</w:t>
-            </w:r>
-            <w:proofErr w:type="spellStart"/>
-            <w:r>
-              <w:rPr>
-                <w:rFonts w:ascii="Times New Roman" w:eastAsia="Times New Roman" w:hAnsi="Times New Roman" w:cs="Times New Roman"/>
-                <w:sz w:val="24"/>
-                <w:szCs w:val="24"/>
-                <w:lang w:eastAsia="en-IN"/>
-              </w:rPr>
-              <w:t>Autowired</w:t>
-            </w:r>
-            <w:proofErr w:type="spellEnd"/>
-            <w:r>
-              <w:rPr>
-                <w:rFonts w:ascii="Times New Roman" w:eastAsia="Times New Roman" w:hAnsi="Times New Roman" w:cs="Times New Roman"/>
-                <w:sz w:val="24"/>
-                <w:szCs w:val="24"/>
-                <w:lang w:eastAsia="en-IN"/>
-              </w:rPr>
-              <w:t>, @Qualifier, @Primary, Bean Scopes, Profiles, Configuration Properties</w:t>
+              <w:t>@Autowired, @Qualifier, @Primary, Bean Scopes, Profiles, Configuration Properties</w:t>
             </w:r>
           </w:p>
         </w:tc>
@@ -1909,7 +1774,7 @@
         </w:trPr>
         <w:tc>
           <w:tcPr>
-            <w:tcW w:w="0" w:type="auto"/>
+            <w:tcW w:w="3216" w:type="dxa"/>
             <w:vAlign w:val="center"/>
             <w:hideMark/>
           </w:tcPr>
@@ -1932,26 +1797,13 @@
                 <w:szCs w:val="24"/>
                 <w:lang w:eastAsia="en-IN"/>
               </w:rPr>
-              <w:t xml:space="preserve">Wednesday – MySQL + </w:t>
-            </w:r>
-            <w:proofErr w:type="spellStart"/>
-            <w:r>
-              <w:rPr>
-                <w:rFonts w:ascii="Times New Roman" w:eastAsia="Times New Roman" w:hAnsi="Times New Roman" w:cs="Times New Roman"/>
-                <w:b/>
-                <w:bCs/>
-                <w:sz w:val="24"/>
-                <w:szCs w:val="24"/>
-                <w:lang w:eastAsia="en-IN"/>
-              </w:rPr>
-              <w:t>MongoDB</w:t>
-            </w:r>
-            <w:proofErr w:type="spellEnd"/>
+              <w:t>Wednesday – MySQL + MongoDB</w:t>
+            </w:r>
           </w:p>
         </w:tc>
         <w:tc>
           <w:tcPr>
-            <w:tcW w:w="0" w:type="auto"/>
+            <w:tcW w:w="5720" w:type="dxa"/>
             <w:vAlign w:val="center"/>
             <w:hideMark/>
           </w:tcPr>
@@ -1983,7 +1835,7 @@
         </w:trPr>
         <w:tc>
           <w:tcPr>
-            <w:tcW w:w="0" w:type="auto"/>
+            <w:tcW w:w="3216" w:type="dxa"/>
             <w:vAlign w:val="center"/>
             <w:hideMark/>
           </w:tcPr>
@@ -2012,7 +1864,7 @@
         </w:tc>
         <w:tc>
           <w:tcPr>
-            <w:tcW w:w="0" w:type="auto"/>
+            <w:tcW w:w="5720" w:type="dxa"/>
             <w:vAlign w:val="center"/>
             <w:hideMark/>
           </w:tcPr>
@@ -2044,7 +1896,7 @@
         </w:trPr>
         <w:tc>
           <w:tcPr>
-            <w:tcW w:w="0" w:type="auto"/>
+            <w:tcW w:w="3216" w:type="dxa"/>
             <w:vAlign w:val="center"/>
             <w:hideMark/>
           </w:tcPr>
@@ -2073,7 +1925,7 @@
         </w:tc>
         <w:tc>
           <w:tcPr>
-            <w:tcW w:w="0" w:type="auto"/>
+            <w:tcW w:w="5720" w:type="dxa"/>
             <w:vAlign w:val="center"/>
             <w:hideMark/>
           </w:tcPr>
@@ -2105,7 +1957,7 @@
         </w:trPr>
         <w:tc>
           <w:tcPr>
-            <w:tcW w:w="0" w:type="auto"/>
+            <w:tcW w:w="3216" w:type="dxa"/>
             <w:vAlign w:val="center"/>
             <w:hideMark/>
           </w:tcPr>
@@ -2134,7 +1986,7 @@
         </w:tc>
         <w:tc>
           <w:tcPr>
-            <w:tcW w:w="0" w:type="auto"/>
+            <w:tcW w:w="5720" w:type="dxa"/>
             <w:vAlign w:val="center"/>
             <w:hideMark/>
           </w:tcPr>
@@ -2148,25 +2000,14 @@
                 <w:lang w:eastAsia="en-IN"/>
               </w:rPr>
             </w:pPr>
-            <w:proofErr w:type="spellStart"/>
-            <w:r>
-              <w:rPr>
-                <w:rFonts w:ascii="Times New Roman" w:eastAsia="Times New Roman" w:hAnsi="Times New Roman" w:cs="Times New Roman"/>
-                <w:sz w:val="24"/>
-                <w:szCs w:val="24"/>
-                <w:lang w:eastAsia="en-IN"/>
-              </w:rPr>
-              <w:t>HashMap</w:t>
-            </w:r>
-            <w:proofErr w:type="spellEnd"/>
-            <w:r>
-              <w:rPr>
-                <w:rFonts w:ascii="Times New Roman" w:eastAsia="Times New Roman" w:hAnsi="Times New Roman" w:cs="Times New Roman"/>
-                <w:sz w:val="24"/>
-                <w:szCs w:val="24"/>
-                <w:lang w:eastAsia="en-IN"/>
-              </w:rPr>
-              <w:t xml:space="preserve"> + Sliding Window DSA + Weekly Revision</w:t>
+            <w:r>
+              <w:rPr>
+                <w:rFonts w:ascii="Times New Roman" w:eastAsia="Times New Roman" w:hAnsi="Times New Roman" w:cs="Times New Roman"/>
+                <w:sz w:val="24"/>
+                <w:szCs w:val="24"/>
+                <w:lang w:eastAsia="en-IN"/>
+              </w:rPr>
+              <w:t>HashMap + Sliding Window DSA + Weekly Revision</w:t>
             </w:r>
           </w:p>
         </w:tc>
@@ -2177,7 +2018,7 @@
         </w:trPr>
         <w:tc>
           <w:tcPr>
-            <w:tcW w:w="0" w:type="auto"/>
+            <w:tcW w:w="3216" w:type="dxa"/>
             <w:vAlign w:val="center"/>
             <w:hideMark/>
           </w:tcPr>
@@ -2206,7 +2047,7 @@
         </w:tc>
         <w:tc>
           <w:tcPr>
-            <w:tcW w:w="0" w:type="auto"/>
+            <w:tcW w:w="5720" w:type="dxa"/>
             <w:vAlign w:val="center"/>
             <w:hideMark/>
           </w:tcPr>
@@ -2250,7 +2091,7 @@
           <w:szCs w:val="24"/>
           <w:lang w:eastAsia="en-IN"/>
         </w:rPr>
-        <w:pict>
+        <w:pict w14:anchorId="53565AF5">
           <v:rect id="_x0000_i1027" style="width:0;height:1.5pt" o:hralign="center" o:hrstd="t" o:hr="t" fillcolor="#a0a0a0" stroked="f"/>
         </w:pict>
       </w:r>
@@ -2519,21 +2360,8 @@
                 <w:szCs w:val="24"/>
                 <w:lang w:eastAsia="en-IN"/>
               </w:rPr>
-              <w:t xml:space="preserve">Wednesday – MySQL + </w:t>
-            </w:r>
-            <w:proofErr w:type="spellStart"/>
-            <w:r>
-              <w:rPr>
-                <w:rFonts w:ascii="Times New Roman" w:eastAsia="Times New Roman" w:hAnsi="Times New Roman" w:cs="Times New Roman"/>
-                <w:b/>
-                <w:bCs/>
-                <w:sz w:val="24"/>
-                <w:szCs w:val="24"/>
-                <w:lang w:eastAsia="en-IN"/>
-              </w:rPr>
-              <w:t>MongoDB</w:t>
-            </w:r>
-            <w:proofErr w:type="spellEnd"/>
+              <w:t>Wednesday – MySQL + MongoDB</w:t>
+            </w:r>
           </w:p>
         </w:tc>
         <w:tc>
@@ -2826,7 +2654,7 @@
           <w:szCs w:val="24"/>
           <w:lang w:eastAsia="en-IN"/>
         </w:rPr>
-        <w:pict>
+        <w:pict w14:anchorId="32EC3ECC">
           <v:rect id="_x0000_i1028" style="width:0;height:1.5pt" o:hralign="center" o:hrstd="t" o:hr="t" fillcolor="#a0a0a0" stroked="f"/>
         </w:pict>
       </w:r>
@@ -3127,21 +2955,8 @@
                 <w:lang w:eastAsia="en-IN"/>
               </w:rPr>
               <w:lastRenderedPageBreak/>
-              <w:t xml:space="preserve">Wednesday – MySQL + </w:t>
-            </w:r>
-            <w:proofErr w:type="spellStart"/>
-            <w:r>
-              <w:rPr>
-                <w:rFonts w:ascii="Times New Roman" w:eastAsia="Times New Roman" w:hAnsi="Times New Roman" w:cs="Times New Roman"/>
-                <w:b/>
-                <w:bCs/>
-                <w:sz w:val="24"/>
-                <w:szCs w:val="24"/>
-                <w:lang w:eastAsia="en-IN"/>
-              </w:rPr>
-              <w:t>MongoDB</w:t>
-            </w:r>
-            <w:proofErr w:type="spellEnd"/>
+              <w:t>Wednesday – MySQL + MongoDB</w:t>
+            </w:r>
           </w:p>
         </w:tc>
         <w:tc>
@@ -3167,27 +2982,7 @@
                 <w:szCs w:val="24"/>
                 <w:lang w:eastAsia="en-IN"/>
               </w:rPr>
-              <w:t xml:space="preserve">Index Optimization, Explain Plan, </w:t>
-            </w:r>
-            <w:proofErr w:type="spellStart"/>
-            <w:r>
-              <w:rPr>
-                <w:rFonts w:ascii="Times New Roman" w:eastAsia="Times New Roman" w:hAnsi="Times New Roman" w:cs="Times New Roman"/>
-                <w:sz w:val="24"/>
-                <w:szCs w:val="24"/>
-                <w:lang w:eastAsia="en-IN"/>
-              </w:rPr>
-              <w:t>MongoDB</w:t>
-            </w:r>
-            <w:proofErr w:type="spellEnd"/>
-            <w:r>
-              <w:rPr>
-                <w:rFonts w:ascii="Times New Roman" w:eastAsia="Times New Roman" w:hAnsi="Times New Roman" w:cs="Times New Roman"/>
-                <w:sz w:val="24"/>
-                <w:szCs w:val="24"/>
-                <w:lang w:eastAsia="en-IN"/>
-              </w:rPr>
-              <w:t xml:space="preserve"> Indexes</w:t>
+              <w:t>Index Optimization, Explain Plan, MongoDB Indexes</w:t>
             </w:r>
           </w:p>
         </w:tc>
@@ -3259,27 +3054,7 @@
                 <w:szCs w:val="24"/>
                 <w:lang w:eastAsia="en-IN"/>
               </w:rPr>
-              <w:t xml:space="preserve"> Observables, Subjects, </w:t>
-            </w:r>
-            <w:proofErr w:type="spellStart"/>
-            <w:r>
-              <w:rPr>
-                <w:rFonts w:ascii="Times New Roman" w:eastAsia="Times New Roman" w:hAnsi="Times New Roman" w:cs="Times New Roman"/>
-                <w:sz w:val="24"/>
-                <w:szCs w:val="24"/>
-                <w:lang w:eastAsia="en-IN"/>
-              </w:rPr>
-              <w:t>Async</w:t>
-            </w:r>
-            <w:proofErr w:type="spellEnd"/>
-            <w:r>
-              <w:rPr>
-                <w:rFonts w:ascii="Times New Roman" w:eastAsia="Times New Roman" w:hAnsi="Times New Roman" w:cs="Times New Roman"/>
-                <w:sz w:val="24"/>
-                <w:szCs w:val="24"/>
-                <w:lang w:eastAsia="en-IN"/>
-              </w:rPr>
-              <w:t xml:space="preserve"> Pipe</w:t>
+              <w:t xml:space="preserve"> Observables, Subjects, Async Pipe</w:t>
             </w:r>
           </w:p>
         </w:tc>
@@ -3340,27 +3115,7 @@
                 <w:szCs w:val="24"/>
                 <w:lang w:eastAsia="en-IN"/>
               </w:rPr>
-              <w:t xml:space="preserve">Caching, </w:t>
-            </w:r>
-            <w:proofErr w:type="spellStart"/>
-            <w:r>
-              <w:rPr>
-                <w:rFonts w:ascii="Times New Roman" w:eastAsia="Times New Roman" w:hAnsi="Times New Roman" w:cs="Times New Roman"/>
-                <w:sz w:val="24"/>
-                <w:szCs w:val="24"/>
-                <w:lang w:eastAsia="en-IN"/>
-              </w:rPr>
-              <w:t>Redis</w:t>
-            </w:r>
-            <w:proofErr w:type="spellEnd"/>
-            <w:r>
-              <w:rPr>
-                <w:rFonts w:ascii="Times New Roman" w:eastAsia="Times New Roman" w:hAnsi="Times New Roman" w:cs="Times New Roman"/>
-                <w:sz w:val="24"/>
-                <w:szCs w:val="24"/>
-                <w:lang w:eastAsia="en-IN"/>
-              </w:rPr>
-              <w:t xml:space="preserve"> Basics (concept), Performance Improvements in Your Project</w:t>
+              <w:t>Caching, Redis Basics (concept), Performance Improvements in Your Project</w:t>
             </w:r>
           </w:p>
         </w:tc>
@@ -3505,7 +3260,7 @@
           <w:szCs w:val="24"/>
           <w:lang w:eastAsia="en-IN"/>
         </w:rPr>
-        <w:pict>
+        <w:pict w14:anchorId="2C31F120">
           <v:rect id="_x0000_i1029" style="width:0;height:1.5pt" o:hralign="center" o:hrstd="t" o:hr="t" fillcolor="#a0a0a0" stroked="f"/>
         </w:pict>
       </w:r>
@@ -3774,21 +3529,8 @@
                 <w:szCs w:val="24"/>
                 <w:lang w:eastAsia="en-IN"/>
               </w:rPr>
-              <w:t xml:space="preserve">Wednesday – MySQL + </w:t>
-            </w:r>
-            <w:proofErr w:type="spellStart"/>
-            <w:r>
-              <w:rPr>
-                <w:rFonts w:ascii="Times New Roman" w:eastAsia="Times New Roman" w:hAnsi="Times New Roman" w:cs="Times New Roman"/>
-                <w:b/>
-                <w:bCs/>
-                <w:sz w:val="24"/>
-                <w:szCs w:val="24"/>
-                <w:lang w:eastAsia="en-IN"/>
-              </w:rPr>
-              <w:t>MongoDB</w:t>
-            </w:r>
-            <w:proofErr w:type="spellEnd"/>
+              <w:t>Wednesday – MySQL + MongoDB</w:t>
+            </w:r>
           </w:p>
         </w:tc>
         <w:tc>
@@ -4081,7 +3823,7 @@
           <w:szCs w:val="24"/>
           <w:lang w:eastAsia="en-IN"/>
         </w:rPr>
-        <w:pict>
+        <w:pict w14:anchorId="12FC2A60">
           <v:rect id="_x0000_i1030" style="width:0;height:1.5pt" o:hralign="center" o:hrstd="t" o:hr="t" fillcolor="#a0a0a0" stroked="f"/>
         </w:pict>
       </w:r>
@@ -4110,33 +3852,7 @@
           <w:szCs w:val="48"/>
           <w:lang w:eastAsia="en-IN"/>
         </w:rPr>
-        <w:t xml:space="preserve">Week 6 – </w:t>
-      </w:r>
-      <w:proofErr w:type="spellStart"/>
-      <w:r>
-        <w:rPr>
-          <w:rFonts w:ascii="Times New Roman" w:eastAsia="Times New Roman" w:hAnsi="Times New Roman" w:cs="Times New Roman"/>
-          <w:b/>
-          <w:bCs/>
-          <w:kern w:val="36"/>
-          <w:sz w:val="48"/>
-          <w:szCs w:val="48"/>
-          <w:lang w:eastAsia="en-IN"/>
-        </w:rPr>
-        <w:t>Microservices</w:t>
-      </w:r>
-      <w:proofErr w:type="spellEnd"/>
-      <w:r>
-        <w:rPr>
-          <w:rFonts w:ascii="Times New Roman" w:eastAsia="Times New Roman" w:hAnsi="Times New Roman" w:cs="Times New Roman"/>
-          <w:b/>
-          <w:bCs/>
-          <w:kern w:val="36"/>
-          <w:sz w:val="48"/>
-          <w:szCs w:val="48"/>
-          <w:lang w:eastAsia="en-IN"/>
-        </w:rPr>
-        <w:t xml:space="preserve"> &amp; Messaging</w:t>
+        <w:t>Week 6 – Microservices &amp; Messaging</w:t>
       </w:r>
     </w:p>
     <w:tbl>
@@ -4335,25 +4051,14 @@
                 <w:lang w:eastAsia="en-IN"/>
               </w:rPr>
             </w:pPr>
-            <w:proofErr w:type="spellStart"/>
-            <w:r>
-              <w:rPr>
-                <w:rFonts w:ascii="Times New Roman" w:eastAsia="Times New Roman" w:hAnsi="Times New Roman" w:cs="Times New Roman"/>
-                <w:sz w:val="24"/>
-                <w:szCs w:val="24"/>
-                <w:lang w:eastAsia="en-IN"/>
-              </w:rPr>
-              <w:t>Microservices</w:t>
-            </w:r>
-            <w:proofErr w:type="spellEnd"/>
-            <w:r>
-              <w:rPr>
-                <w:rFonts w:ascii="Times New Roman" w:eastAsia="Times New Roman" w:hAnsi="Times New Roman" w:cs="Times New Roman"/>
-                <w:sz w:val="24"/>
-                <w:szCs w:val="24"/>
-                <w:lang w:eastAsia="en-IN"/>
-              </w:rPr>
-              <w:t>, Feign Client, API Gateway, Service Discovery, Circuit Breaker</w:t>
+            <w:r>
+              <w:rPr>
+                <w:rFonts w:ascii="Times New Roman" w:eastAsia="Times New Roman" w:hAnsi="Times New Roman" w:cs="Times New Roman"/>
+                <w:sz w:val="24"/>
+                <w:szCs w:val="24"/>
+                <w:lang w:eastAsia="en-IN"/>
+              </w:rPr>
+              <w:t>Microservices, Feign Client, API Gateway, Service Discovery, Circuit Breaker</w:t>
             </w:r>
           </w:p>
         </w:tc>
@@ -4387,21 +4092,8 @@
                 <w:szCs w:val="24"/>
                 <w:lang w:eastAsia="en-IN"/>
               </w:rPr>
-              <w:t xml:space="preserve">Wednesday – MySQL + </w:t>
-            </w:r>
-            <w:proofErr w:type="spellStart"/>
-            <w:r>
-              <w:rPr>
-                <w:rFonts w:ascii="Times New Roman" w:eastAsia="Times New Roman" w:hAnsi="Times New Roman" w:cs="Times New Roman"/>
-                <w:b/>
-                <w:bCs/>
-                <w:sz w:val="24"/>
-                <w:szCs w:val="24"/>
-                <w:lang w:eastAsia="en-IN"/>
-              </w:rPr>
-              <w:t>MongoDB</w:t>
-            </w:r>
-            <w:proofErr w:type="spellEnd"/>
+              <w:t>Wednesday – MySQL + MongoDB</w:t>
+            </w:r>
           </w:p>
         </w:tc>
         <w:tc>
@@ -4562,25 +4254,14 @@
                 <w:lang w:eastAsia="en-IN"/>
               </w:rPr>
             </w:pPr>
-            <w:proofErr w:type="spellStart"/>
-            <w:r>
-              <w:rPr>
-                <w:rFonts w:ascii="Times New Roman" w:eastAsia="Times New Roman" w:hAnsi="Times New Roman" w:cs="Times New Roman"/>
-                <w:sz w:val="24"/>
-                <w:szCs w:val="24"/>
-                <w:lang w:eastAsia="en-IN"/>
-              </w:rPr>
-              <w:t>RabbitMQ</w:t>
-            </w:r>
-            <w:proofErr w:type="spellEnd"/>
-            <w:r>
-              <w:rPr>
-                <w:rFonts w:ascii="Times New Roman" w:eastAsia="Times New Roman" w:hAnsi="Times New Roman" w:cs="Times New Roman"/>
-                <w:sz w:val="24"/>
-                <w:szCs w:val="24"/>
-                <w:lang w:eastAsia="en-IN"/>
-              </w:rPr>
-              <w:t>, Event-Driven Architecture, Production Issues, AI Assistant Integration</w:t>
+            <w:r>
+              <w:rPr>
+                <w:rFonts w:ascii="Times New Roman" w:eastAsia="Times New Roman" w:hAnsi="Times New Roman" w:cs="Times New Roman"/>
+                <w:sz w:val="24"/>
+                <w:szCs w:val="24"/>
+                <w:lang w:eastAsia="en-IN"/>
+              </w:rPr>
+              <w:t>RabbitMQ, Event-Driven Architecture, Production Issues, AI Assistant Integration</w:t>
             </w:r>
           </w:p>
         </w:tc>
@@ -4725,7 +4406,7 @@
           <w:szCs w:val="24"/>
           <w:lang w:eastAsia="en-IN"/>
         </w:rPr>
-        <w:pict>
+        <w:pict w14:anchorId="6EF25EDE">
           <v:rect id="_x0000_i1031" style="width:0;height:1.5pt" o:hralign="center" o:hrstd="t" o:hr="t" fillcolor="#a0a0a0" stroked="f"/>
         </w:pict>
       </w:r>
@@ -4865,27 +4546,7 @@
           <w:szCs w:val="24"/>
           <w:lang w:eastAsia="en-IN"/>
         </w:rPr>
-        <w:t xml:space="preserve"> Spring Boot + </w:t>
-      </w:r>
-      <w:proofErr w:type="spellStart"/>
-      <w:r>
-        <w:rPr>
-          <w:rFonts w:ascii="Times New Roman" w:eastAsia="Times New Roman" w:hAnsi="Times New Roman" w:cs="Times New Roman"/>
-          <w:sz w:val="24"/>
-          <w:szCs w:val="24"/>
-          <w:lang w:eastAsia="en-IN"/>
-        </w:rPr>
-        <w:t>Microservices</w:t>
-      </w:r>
-      <w:proofErr w:type="spellEnd"/>
-      <w:r>
-        <w:rPr>
-          <w:rFonts w:ascii="Times New Roman" w:eastAsia="Times New Roman" w:hAnsi="Times New Roman" w:cs="Times New Roman"/>
-          <w:sz w:val="24"/>
-          <w:szCs w:val="24"/>
-          <w:lang w:eastAsia="en-IN"/>
-        </w:rPr>
-        <w:t xml:space="preserve"> revision </w:t>
+        <w:t xml:space="preserve"> Spring Boot + Microservices revision </w:t>
       </w:r>
     </w:p>
     <w:p>
@@ -4920,27 +4581,7 @@
           <w:szCs w:val="24"/>
           <w:lang w:eastAsia="en-IN"/>
         </w:rPr>
-        <w:t xml:space="preserve"> SQL + </w:t>
-      </w:r>
-      <w:proofErr w:type="spellStart"/>
-      <w:r>
-        <w:rPr>
-          <w:rFonts w:ascii="Times New Roman" w:eastAsia="Times New Roman" w:hAnsi="Times New Roman" w:cs="Times New Roman"/>
-          <w:sz w:val="24"/>
-          <w:szCs w:val="24"/>
-          <w:lang w:eastAsia="en-IN"/>
-        </w:rPr>
-        <w:t>MongoDB</w:t>
-      </w:r>
-      <w:proofErr w:type="spellEnd"/>
-      <w:r>
-        <w:rPr>
-          <w:rFonts w:ascii="Times New Roman" w:eastAsia="Times New Roman" w:hAnsi="Times New Roman" w:cs="Times New Roman"/>
-          <w:sz w:val="24"/>
-          <w:szCs w:val="24"/>
-          <w:lang w:eastAsia="en-IN"/>
-        </w:rPr>
-        <w:t xml:space="preserve"> revision </w:t>
+        <w:t xml:space="preserve"> SQL + MongoDB revision </w:t>
       </w:r>
     </w:p>
     <w:p>
@@ -5270,47 +4911,7 @@
           <w:szCs w:val="24"/>
           <w:lang w:eastAsia="en-IN"/>
         </w:rPr>
-        <w:t xml:space="preserve"> </w:t>
-      </w:r>
-      <w:proofErr w:type="spellStart"/>
-      <w:r>
-        <w:rPr>
-          <w:rFonts w:ascii="Times New Roman" w:eastAsia="Times New Roman" w:hAnsi="Times New Roman" w:cs="Times New Roman"/>
-          <w:sz w:val="24"/>
-          <w:szCs w:val="24"/>
-          <w:lang w:eastAsia="en-IN"/>
-        </w:rPr>
-        <w:t>Microservices</w:t>
-      </w:r>
-      <w:proofErr w:type="spellEnd"/>
-      <w:r>
-        <w:rPr>
-          <w:rFonts w:ascii="Times New Roman" w:eastAsia="Times New Roman" w:hAnsi="Times New Roman" w:cs="Times New Roman"/>
-          <w:sz w:val="24"/>
-          <w:szCs w:val="24"/>
-          <w:lang w:eastAsia="en-IN"/>
-        </w:rPr>
-        <w:t xml:space="preserve"> + </w:t>
-      </w:r>
-      <w:proofErr w:type="spellStart"/>
-      <w:r>
-        <w:rPr>
-          <w:rFonts w:ascii="Times New Roman" w:eastAsia="Times New Roman" w:hAnsi="Times New Roman" w:cs="Times New Roman"/>
-          <w:sz w:val="24"/>
-          <w:szCs w:val="24"/>
-          <w:lang w:eastAsia="en-IN"/>
-        </w:rPr>
-        <w:t>RabbitMQ</w:t>
-      </w:r>
-      <w:proofErr w:type="spellEnd"/>
-      <w:r>
-        <w:rPr>
-          <w:rFonts w:ascii="Times New Roman" w:eastAsia="Times New Roman" w:hAnsi="Times New Roman" w:cs="Times New Roman"/>
-          <w:sz w:val="24"/>
-          <w:szCs w:val="24"/>
-          <w:lang w:eastAsia="en-IN"/>
-        </w:rPr>
-        <w:t xml:space="preserve"> </w:t>
+        <w:t xml:space="preserve"> Microservices + RabbitMQ </w:t>
       </w:r>
     </w:p>
     <w:p>
@@ -5409,27 +5010,7 @@
           <w:szCs w:val="24"/>
           <w:lang w:eastAsia="en-IN"/>
         </w:rPr>
-        <w:t xml:space="preserve"> </w:t>
-      </w:r>
-      <w:proofErr w:type="spellStart"/>
-      <w:r>
-        <w:rPr>
-          <w:rFonts w:ascii="Times New Roman" w:eastAsia="Times New Roman" w:hAnsi="Times New Roman" w:cs="Times New Roman"/>
-          <w:sz w:val="24"/>
-          <w:szCs w:val="24"/>
-          <w:lang w:eastAsia="en-IN"/>
-        </w:rPr>
-        <w:t>MongoDB</w:t>
-      </w:r>
-      <w:proofErr w:type="spellEnd"/>
-      <w:r>
-        <w:rPr>
-          <w:rFonts w:ascii="Times New Roman" w:eastAsia="Times New Roman" w:hAnsi="Times New Roman" w:cs="Times New Roman"/>
-          <w:sz w:val="24"/>
-          <w:szCs w:val="24"/>
-          <w:lang w:eastAsia="en-IN"/>
-        </w:rPr>
-        <w:t xml:space="preserve"> (unless explicitly required) </w:t>
+        <w:t xml:space="preserve"> MongoDB (unless explicitly required) </w:t>
       </w:r>
     </w:p>
     <w:p>
@@ -5510,14 +5091,12 @@
       <w:r>
         <w:t xml:space="preserve">, </w:t>
       </w:r>
-      <w:proofErr w:type="spellStart"/>
       <w:r>
         <w:rPr>
           <w:rStyle w:val="whitespace-normal"/>
         </w:rPr>
         <w:t>Capgemini</w:t>
       </w:r>
-      <w:proofErr w:type="spellEnd"/>
       <w:r>
         <w:t xml:space="preserve">, </w:t>
       </w:r>
@@ -5568,30 +5147,20 @@
       <w:r>
         <w:t xml:space="preserve">, </w:t>
       </w:r>
-      <w:proofErr w:type="spellStart"/>
       <w:r>
         <w:rPr>
           <w:rStyle w:val="whitespace-normal"/>
         </w:rPr>
         <w:t>Nagarro</w:t>
       </w:r>
-      <w:proofErr w:type="spellEnd"/>
       <w:r>
         <w:t xml:space="preserve">, </w:t>
       </w:r>
-      <w:proofErr w:type="spellStart"/>
       <w:r>
         <w:rPr>
           <w:rStyle w:val="whitespace-normal"/>
         </w:rPr>
-        <w:t>Publicis</w:t>
-      </w:r>
-      <w:proofErr w:type="spellEnd"/>
-      <w:r>
-        <w:rPr>
-          <w:rStyle w:val="whitespace-normal"/>
-        </w:rPr>
-        <w:t xml:space="preserve"> Sapient</w:t>
+        <w:t>Publicis Sapient</w:t>
       </w:r>
       <w:r>
         <w:t xml:space="preserve">, and </w:t>
@@ -5915,33 +5484,11 @@
             <w:hideMark/>
           </w:tcPr>
           <w:p>
-            <w:proofErr w:type="spellStart"/>
             <w:r>
               <w:rPr>
                 <w:rStyle w:val="Strong"/>
               </w:rPr>
-              <w:t>Microservices</w:t>
-            </w:r>
-            <w:proofErr w:type="spellEnd"/>
-            <w:r>
-              <w:rPr>
-                <w:rStyle w:val="Strong"/>
-              </w:rPr>
-              <w:t xml:space="preserve"> + </w:t>
-            </w:r>
-            <w:proofErr w:type="spellStart"/>
-            <w:r>
-              <w:rPr>
-                <w:rStyle w:val="Strong"/>
-              </w:rPr>
-              <w:t>RabbitMQ</w:t>
-            </w:r>
-            <w:proofErr w:type="spellEnd"/>
-            <w:r>
-              <w:rPr>
-                <w:rStyle w:val="Strong"/>
-              </w:rPr>
-              <w:t>/Kafka</w:t>
+              <w:t>Microservices + RabbitMQ/Kafka</w:t>
             </w:r>
           </w:p>
         </w:tc>
@@ -6355,19 +5902,9 @@
             <w:hideMark/>
           </w:tcPr>
           <w:p>
-            <w:proofErr w:type="spellStart"/>
-            <w:r>
-              <w:t>Microservices</w:t>
-            </w:r>
-            <w:proofErr w:type="spellEnd"/>
-            <w:r>
-              <w:t xml:space="preserve"> + </w:t>
-            </w:r>
-            <w:proofErr w:type="spellStart"/>
-            <w:r>
-              <w:t>RabbitMQ</w:t>
-            </w:r>
-            <w:proofErr w:type="spellEnd"/>
+            <w:r>
+              <w:t>Microservices + RabbitMQ</w:t>
+            </w:r>
           </w:p>
         </w:tc>
         <w:tc>
@@ -6485,8 +6022,8 @@
     </w:tbl>
     <w:p>
       <w:r>
-        <w:pict>
-          <v:rect id="_x0000_i1039" style="width:0;height:1.5pt" o:hralign="center" o:hrstd="t" o:hr="t" fillcolor="#a0a0a0" stroked="f"/>
+        <w:pict w14:anchorId="632E5B1D">
+          <v:rect id="_x0000_i1032" style="width:0;height:1.5pt" o:hralign="center" o:hrstd="t" o:hr="t" fillcolor="#a0a0a0" stroked="f"/>
         </w:pict>
       </w:r>
     </w:p>
@@ -6794,8 +6331,8 @@
     </w:p>
     <w:p>
       <w:r>
-        <w:pict>
-          <v:rect id="_x0000_i1040" style="width:0;height:1.5pt" o:hralign="center" o:hrstd="t" o:hr="t" fillcolor="#a0a0a0" stroked="f"/>
+        <w:pict w14:anchorId="046A5A1B">
+          <v:rect id="_x0000_i1033" style="width:0;height:1.5pt" o:hralign="center" o:hrstd="t" o:hr="t" fillcolor="#a0a0a0" stroked="f"/>
         </w:pict>
       </w:r>
     </w:p>
@@ -6909,13 +6446,8 @@
       <w:pPr>
         <w:pStyle w:val="NormalWeb"/>
       </w:pPr>
-      <w:proofErr w:type="gramStart"/>
-      <w:r>
-        <w:t>you'll</w:t>
-      </w:r>
-      <w:proofErr w:type="gramEnd"/>
-      <w:r>
-        <w:t xml:space="preserve"> be well prepared for a large percentage of Java backend interviews.</w:t>
+      <w:r>
+        <w:t>you'll be well prepared for a large percentage of Java backend interviews.</w:t>
       </w:r>
     </w:p>
     <w:p>
@@ -6924,15 +6456,7 @@
       </w:pPr>
       <w:r>
         <w:lastRenderedPageBreak/>
-        <w:t>The remaining topics—</w:t>
-      </w:r>
-      <w:proofErr w:type="spellStart"/>
-      <w:r>
-        <w:t>Microservices</w:t>
-      </w:r>
-      <w:proofErr w:type="spellEnd"/>
-      <w:r>
-        <w:t>, messaging systems, basic system design, and Angular—are still worth preparing, but they're usually used to distinguish stronger candidates rather than replacing the fundamentals.</w:t>
+        <w:t>The remaining topics—Microservices, messaging systems, basic system design, and Angular—are still worth preparing, but they're usually used to distinguish stronger candidates rather than replacing the fundamentals.</w:t>
       </w:r>
     </w:p>
     <w:p>
@@ -6971,7 +6495,7 @@
     </w:p>
     <w:p>
       <w:r>
-        <w:object w:dxaOrig="225" w:dyaOrig="225">
+        <w:object w:dxaOrig="1440" w:dyaOrig="1440" w14:anchorId="7F0F66DE">
           <v:shapetype id="_x0000_t75" coordsize="21600,21600" o:spt="75" o:preferrelative="t" path="m@4@5l@4@11@9@11@9@5xe" filled="f" stroked="f">
             <v:stroke joinstyle="miter"/>
             <v:formulas>
@@ -6991,10 +6515,10 @@
             <v:path o:extrusionok="f" gradientshapeok="t" o:connecttype="rect"/>
             <o:lock v:ext="edit" aspectratio="t"/>
           </v:shapetype>
-          <v:shape id="_x0000_i1045" type="#_x0000_t75" style="width:132pt;height:60pt" o:ole="">
+          <v:shape id="_x0000_i1046" type="#_x0000_t75" style="width:136.5pt;height:60.75pt" o:ole="">
             <v:imagedata r:id="rId5" o:title=""/>
           </v:shape>
-          <w:control r:id="rId6" w:name="DefaultOcxName" w:shapeid="_x0000_i1045"/>
+          <w:control r:id="rId6" w:name="DefaultOcxName" w:shapeid="_x0000_i1046"/>
         </w:object>
       </w:r>
     </w:p>
@@ -7031,8 +6555,8 @@
     </w:p>
     <w:p>
       <w:r>
-        <w:pict>
-          <v:rect id="_x0000_i1046" style="width:0;height:1.5pt" o:hralign="center" o:hrstd="t" o:hr="t" fillcolor="#a0a0a0" stroked="f"/>
+        <w:pict w14:anchorId="0CEA412C">
+          <v:rect id="_x0000_i1036" style="width:0;height:1.5pt" o:hralign="center" o:hrstd="t" o:hr="t" fillcolor="#a0a0a0" stroked="f"/>
         </w:pict>
       </w:r>
     </w:p>
@@ -7094,23 +6618,35 @@
         <w:spacing w:before="100" w:beforeAutospacing="1" w:after="100" w:afterAutospacing="1" w:line="240" w:lineRule="auto"/>
       </w:pPr>
       <w:r>
-        <w:t xml:space="preserve">String vs </w:t>
+        <w:t xml:space="preserve">String vs StringBuilder vs </w:t>
       </w:r>
       <w:proofErr w:type="spellStart"/>
       <w:r>
-        <w:t>StringBuilder</w:t>
+        <w:t>StringBuffer</w:t>
       </w:r>
       <w:proofErr w:type="spellEnd"/>
       <w:r>
-        <w:t xml:space="preserve"> vs </w:t>
+        <w:t xml:space="preserve"> </w:t>
+      </w:r>
+    </w:p>
+    <w:p>
+      <w:pPr>
+        <w:numPr>
+          <w:ilvl w:val="0"/>
+          <w:numId w:val="9"/>
+        </w:numPr>
+        <w:spacing w:before="100" w:beforeAutospacing="1" w:after="100" w:afterAutospacing="1" w:line="240" w:lineRule="auto"/>
+      </w:pPr>
+      <w:r>
+        <w:t xml:space="preserve">equals() vs </w:t>
       </w:r>
       <w:proofErr w:type="spellStart"/>
       <w:r>
-        <w:t>StringBuffer</w:t>
+        <w:t>hashCode</w:t>
       </w:r>
       <w:proofErr w:type="spellEnd"/>
       <w:r>
-        <w:t xml:space="preserve"> </w:t>
+        <w:t xml:space="preserve">() </w:t>
       </w:r>
     </w:p>
     <w:p>
@@ -7122,15 +6658,7 @@
         <w:spacing w:before="100" w:beforeAutospacing="1" w:after="100" w:afterAutospacing="1" w:line="240" w:lineRule="auto"/>
       </w:pPr>
       <w:r>
-        <w:t xml:space="preserve">equals() vs </w:t>
-      </w:r>
-      <w:proofErr w:type="spellStart"/>
-      <w:r>
-        <w:t>hashCode</w:t>
-      </w:r>
-      <w:proofErr w:type="spellEnd"/>
-      <w:r>
-        <w:t xml:space="preserve">() </w:t>
+        <w:t xml:space="preserve">Wrapper Classes </w:t>
       </w:r>
     </w:p>
     <w:p>
@@ -7142,18 +6670,6 @@
         <w:spacing w:before="100" w:beforeAutospacing="1" w:after="100" w:afterAutospacing="1" w:line="240" w:lineRule="auto"/>
       </w:pPr>
       <w:r>
-        <w:t xml:space="preserve">Wrapper Classes </w:t>
-      </w:r>
-    </w:p>
-    <w:p>
-      <w:pPr>
-        <w:numPr>
-          <w:ilvl w:val="0"/>
-          <w:numId w:val="9"/>
-        </w:numPr>
-        <w:spacing w:before="100" w:beforeAutospacing="1" w:after="100" w:afterAutospacing="1" w:line="240" w:lineRule="auto"/>
-      </w:pPr>
-      <w:r>
         <w:t xml:space="preserve">Immutable Class </w:t>
       </w:r>
     </w:p>
@@ -7197,13 +6713,8 @@
         </w:numPr>
         <w:spacing w:before="100" w:beforeAutospacing="1" w:after="100" w:afterAutospacing="1" w:line="240" w:lineRule="auto"/>
       </w:pPr>
-      <w:proofErr w:type="spellStart"/>
-      <w:r>
-        <w:t>HashMap</w:t>
-      </w:r>
-      <w:proofErr w:type="spellEnd"/>
-      <w:r>
-        <w:t xml:space="preserve"> Internal Working </w:t>
+      <w:r>
+        <w:t xml:space="preserve">HashMap Internal Working </w:t>
       </w:r>
       <w:r>
         <w:rPr>
@@ -7257,13 +6768,8 @@
         </w:numPr>
         <w:spacing w:before="100" w:beforeAutospacing="1" w:after="100" w:afterAutospacing="1" w:line="240" w:lineRule="auto"/>
       </w:pPr>
-      <w:proofErr w:type="spellStart"/>
-      <w:r>
-        <w:t>HashSet</w:t>
-      </w:r>
-      <w:proofErr w:type="spellEnd"/>
-      <w:r>
-        <w:t xml:space="preserve"> </w:t>
+      <w:r>
+        <w:t xml:space="preserve">HashSet </w:t>
       </w:r>
     </w:p>
     <w:p>
@@ -7650,8 +7156,8 @@
         <w:spacing w:after="0"/>
       </w:pPr>
       <w:r>
-        <w:pict>
-          <v:rect id="_x0000_i1047" style="width:0;height:1.5pt" o:hralign="center" o:hrstd="t" o:hr="t" fillcolor="#a0a0a0" stroked="f"/>
+        <w:pict w14:anchorId="11D2E577">
+          <v:rect id="_x0000_i1037" style="width:0;height:1.5pt" o:hralign="center" o:hrstd="t" o:hr="t" fillcolor="#a0a0a0" stroked="f"/>
         </w:pict>
       </w:r>
     </w:p>
@@ -7700,13 +7206,8 @@
         </w:numPr>
         <w:spacing w:before="100" w:beforeAutospacing="1" w:after="100" w:afterAutospacing="1" w:line="240" w:lineRule="auto"/>
       </w:pPr>
-      <w:proofErr w:type="spellStart"/>
-      <w:r>
-        <w:t>IoC</w:t>
-      </w:r>
-      <w:proofErr w:type="spellEnd"/>
-      <w:r>
-        <w:t xml:space="preserve"> </w:t>
+      <w:r>
+        <w:t xml:space="preserve">IoC </w:t>
       </w:r>
     </w:p>
     <w:p>
@@ -7820,15 +7321,7 @@
         <w:spacing w:before="100" w:beforeAutospacing="1" w:after="100" w:afterAutospacing="1" w:line="240" w:lineRule="auto"/>
       </w:pPr>
       <w:r>
-        <w:t>@</w:t>
-      </w:r>
-      <w:proofErr w:type="spellStart"/>
-      <w:r>
-        <w:t>Autowired</w:t>
-      </w:r>
-      <w:proofErr w:type="spellEnd"/>
-      <w:r>
-        <w:t xml:space="preserve"> </w:t>
+        <w:t xml:space="preserve">@Autowired </w:t>
       </w:r>
     </w:p>
     <w:p>
@@ -8225,13 +7718,8 @@
         </w:numPr>
         <w:spacing w:before="100" w:beforeAutospacing="1" w:after="100" w:afterAutospacing="1" w:line="240" w:lineRule="auto"/>
       </w:pPr>
-      <w:proofErr w:type="spellStart"/>
-      <w:r>
-        <w:t>Microservices</w:t>
-      </w:r>
-      <w:proofErr w:type="spellEnd"/>
-      <w:r>
-        <w:t xml:space="preserve"> Basics </w:t>
+      <w:r>
+        <w:t xml:space="preserve">Microservices Basics </w:t>
       </w:r>
     </w:p>
     <w:p>
@@ -8240,8 +7728,8 @@
       </w:pPr>
       <w:r>
         <w:lastRenderedPageBreak/>
-        <w:pict>
-          <v:rect id="_x0000_i1048" style="width:0;height:1.5pt" o:hralign="center" o:hrstd="t" o:hr="t" fillcolor="#a0a0a0" stroked="f"/>
+        <w:pict w14:anchorId="62B9CDB6">
+          <v:rect id="_x0000_i1038" style="width:0;height:1.5pt" o:hralign="center" o:hrstd="t" o:hr="t" fillcolor="#a0a0a0" stroked="f"/>
         </w:pict>
       </w:r>
     </w:p>
@@ -8250,15 +7738,7 @@
         <w:pStyle w:val="Heading1"/>
       </w:pPr>
       <w:r>
-        <w:t xml:space="preserve">Wednesday – MySQL + </w:t>
-      </w:r>
-      <w:proofErr w:type="spellStart"/>
-      <w:r>
-        <w:t>MongoDB</w:t>
-      </w:r>
-      <w:proofErr w:type="spellEnd"/>
-      <w:r>
-        <w:t xml:space="preserve"> (Very Important </w:t>
+        <w:t xml:space="preserve">Wednesday – MySQL + MongoDB (Very Important </w:t>
       </w:r>
       <w:r>
         <w:rPr>
@@ -8658,85 +8138,83 @@
       <w:pPr>
         <w:pStyle w:val="Heading3"/>
       </w:pPr>
+      <w:r>
+        <w:t>MongoDB</w:t>
+      </w:r>
+    </w:p>
+    <w:p>
+      <w:pPr>
+        <w:numPr>
+          <w:ilvl w:val="0"/>
+          <w:numId w:val="26"/>
+        </w:numPr>
+        <w:spacing w:before="100" w:beforeAutospacing="1" w:after="100" w:afterAutospacing="1" w:line="240" w:lineRule="auto"/>
+      </w:pPr>
+      <w:r>
+        <w:t xml:space="preserve">Documents </w:t>
+      </w:r>
+    </w:p>
+    <w:p>
+      <w:pPr>
+        <w:numPr>
+          <w:ilvl w:val="0"/>
+          <w:numId w:val="26"/>
+        </w:numPr>
+        <w:spacing w:before="100" w:beforeAutospacing="1" w:after="100" w:afterAutospacing="1" w:line="240" w:lineRule="auto"/>
+      </w:pPr>
+      <w:r>
+        <w:t xml:space="preserve">Collections </w:t>
+      </w:r>
+    </w:p>
+    <w:p>
+      <w:pPr>
+        <w:numPr>
+          <w:ilvl w:val="0"/>
+          <w:numId w:val="26"/>
+        </w:numPr>
+        <w:spacing w:before="100" w:beforeAutospacing="1" w:after="100" w:afterAutospacing="1" w:line="240" w:lineRule="auto"/>
+      </w:pPr>
+      <w:r>
+        <w:t xml:space="preserve">Aggregation </w:t>
+      </w:r>
+    </w:p>
+    <w:p>
+      <w:pPr>
+        <w:numPr>
+          <w:ilvl w:val="0"/>
+          <w:numId w:val="26"/>
+        </w:numPr>
+        <w:spacing w:before="100" w:beforeAutospacing="1" w:after="100" w:afterAutospacing="1" w:line="240" w:lineRule="auto"/>
+      </w:pPr>
+      <w:r>
+        <w:t xml:space="preserve">Indexes </w:t>
+      </w:r>
+    </w:p>
+    <w:p>
+      <w:pPr>
+        <w:numPr>
+          <w:ilvl w:val="0"/>
+          <w:numId w:val="26"/>
+        </w:numPr>
+        <w:spacing w:before="100" w:beforeAutospacing="1" w:after="100" w:afterAutospacing="1" w:line="240" w:lineRule="auto"/>
+      </w:pPr>
+      <w:r>
+        <w:t xml:space="preserve">Replication (basic) </w:t>
+      </w:r>
+    </w:p>
+    <w:p>
+      <w:pPr>
+        <w:numPr>
+          <w:ilvl w:val="0"/>
+          <w:numId w:val="26"/>
+        </w:numPr>
+        <w:spacing w:before="100" w:beforeAutospacing="1" w:after="100" w:afterAutospacing="1" w:line="240" w:lineRule="auto"/>
+      </w:pPr>
       <w:proofErr w:type="spellStart"/>
       <w:r>
-        <w:t>MongoDB</w:t>
+        <w:t>Sharding</w:t>
       </w:r>
       <w:proofErr w:type="spellEnd"/>
-    </w:p>
-    <w:p>
-      <w:pPr>
-        <w:numPr>
-          <w:ilvl w:val="0"/>
-          <w:numId w:val="26"/>
-        </w:numPr>
-        <w:spacing w:before="100" w:beforeAutospacing="1" w:after="100" w:afterAutospacing="1" w:line="240" w:lineRule="auto"/>
-      </w:pPr>
-      <w:r>
-        <w:t xml:space="preserve">Documents </w:t>
-      </w:r>
-    </w:p>
-    <w:p>
-      <w:pPr>
-        <w:numPr>
-          <w:ilvl w:val="0"/>
-          <w:numId w:val="26"/>
-        </w:numPr>
-        <w:spacing w:before="100" w:beforeAutospacing="1" w:after="100" w:afterAutospacing="1" w:line="240" w:lineRule="auto"/>
-      </w:pPr>
-      <w:r>
-        <w:t xml:space="preserve">Collections </w:t>
-      </w:r>
-    </w:p>
-    <w:p>
-      <w:pPr>
-        <w:numPr>
-          <w:ilvl w:val="0"/>
-          <w:numId w:val="26"/>
-        </w:numPr>
-        <w:spacing w:before="100" w:beforeAutospacing="1" w:after="100" w:afterAutospacing="1" w:line="240" w:lineRule="auto"/>
-      </w:pPr>
-      <w:r>
-        <w:t xml:space="preserve">Aggregation </w:t>
-      </w:r>
-    </w:p>
-    <w:p>
-      <w:pPr>
-        <w:numPr>
-          <w:ilvl w:val="0"/>
-          <w:numId w:val="26"/>
-        </w:numPr>
-        <w:spacing w:before="100" w:beforeAutospacing="1" w:after="100" w:afterAutospacing="1" w:line="240" w:lineRule="auto"/>
-      </w:pPr>
-      <w:r>
-        <w:t xml:space="preserve">Indexes </w:t>
-      </w:r>
-    </w:p>
-    <w:p>
-      <w:pPr>
-        <w:numPr>
-          <w:ilvl w:val="0"/>
-          <w:numId w:val="26"/>
-        </w:numPr>
-        <w:spacing w:before="100" w:beforeAutospacing="1" w:after="100" w:afterAutospacing="1" w:line="240" w:lineRule="auto"/>
-      </w:pPr>
-      <w:r>
-        <w:t xml:space="preserve">Replication (basic) </w:t>
-      </w:r>
-    </w:p>
-    <w:p>
-      <w:pPr>
-        <w:numPr>
-          <w:ilvl w:val="0"/>
-          <w:numId w:val="26"/>
-        </w:numPr>
-        <w:spacing w:before="100" w:beforeAutospacing="1" w:after="100" w:afterAutospacing="1" w:line="240" w:lineRule="auto"/>
-      </w:pPr>
-      <w:proofErr w:type="spellStart"/>
-      <w:r>
-        <w:t>Sharding</w:t>
-      </w:r>
-      <w:proofErr w:type="spellEnd"/>
       <w:r>
         <w:t xml:space="preserve"> (basic) </w:t>
       </w:r>
@@ -8746,8 +8224,8 @@
         <w:spacing w:after="0"/>
       </w:pPr>
       <w:r>
-        <w:pict>
-          <v:rect id="_x0000_i1049" style="width:0;height:1.5pt" o:hralign="center" o:hrstd="t" o:hr="t" fillcolor="#a0a0a0" stroked="f"/>
+        <w:pict w14:anchorId="0D15A3E6">
+          <v:rect id="_x0000_i1039" style="width:0;height:1.5pt" o:hralign="center" o:hrstd="t" o:hr="t" fillcolor="#a0a0a0" stroked="f"/>
         </w:pict>
       </w:r>
     </w:p>
@@ -8784,13 +8262,8 @@
         </w:numPr>
         <w:spacing w:before="100" w:beforeAutospacing="1" w:after="100" w:afterAutospacing="1" w:line="240" w:lineRule="auto"/>
       </w:pPr>
-      <w:proofErr w:type="spellStart"/>
-      <w:r>
-        <w:t>TypeScript</w:t>
-      </w:r>
-      <w:proofErr w:type="spellEnd"/>
-      <w:r>
-        <w:t xml:space="preserve"> </w:t>
+      <w:r>
+        <w:t xml:space="preserve">TypeScript </w:t>
       </w:r>
     </w:p>
     <w:p>
@@ -9031,13 +8504,8 @@
         </w:numPr>
         <w:spacing w:before="100" w:beforeAutospacing="1" w:after="100" w:afterAutospacing="1" w:line="240" w:lineRule="auto"/>
       </w:pPr>
-      <w:proofErr w:type="spellStart"/>
-      <w:r>
-        <w:t>Async</w:t>
-      </w:r>
-      <w:proofErr w:type="spellEnd"/>
-      <w:r>
-        <w:t xml:space="preserve"> Pipe </w:t>
+      <w:r>
+        <w:t xml:space="preserve">Async Pipe </w:t>
       </w:r>
     </w:p>
     <w:p>
@@ -9101,8 +8569,8 @@
         <w:spacing w:after="0"/>
       </w:pPr>
       <w:r>
-        <w:pict>
-          <v:rect id="_x0000_i1050" style="width:0;height:1.5pt" o:hralign="center" o:hrstd="t" o:hr="t" fillcolor="#a0a0a0" stroked="f"/>
+        <w:pict w14:anchorId="123D6DCC">
+          <v:rect id="_x0000_i1040" style="width:0;height:1.5pt" o:hralign="center" o:hrstd="t" o:hr="t" fillcolor="#a0a0a0" stroked="f"/>
         </w:pict>
       </w:r>
     </w:p>
@@ -9295,13 +8763,8 @@
         </w:numPr>
         <w:spacing w:before="100" w:beforeAutospacing="1" w:after="100" w:afterAutospacing="1" w:line="240" w:lineRule="auto"/>
       </w:pPr>
-      <w:proofErr w:type="spellStart"/>
-      <w:r>
-        <w:t>Redis</w:t>
-      </w:r>
-      <w:proofErr w:type="spellEnd"/>
-      <w:r>
-        <w:t xml:space="preserve"> Concepts </w:t>
+      <w:r>
+        <w:t xml:space="preserve">Redis Concepts </w:t>
       </w:r>
     </w:p>
     <w:p>
@@ -9320,13 +8783,8 @@
         </w:numPr>
         <w:spacing w:before="100" w:beforeAutospacing="1" w:after="100" w:afterAutospacing="1" w:line="240" w:lineRule="auto"/>
       </w:pPr>
-      <w:proofErr w:type="spellStart"/>
-      <w:r>
-        <w:t>RabbitMQ</w:t>
-      </w:r>
-      <w:proofErr w:type="spellEnd"/>
-      <w:r>
-        <w:t xml:space="preserve"> </w:t>
+      <w:r>
+        <w:t xml:space="preserve">RabbitMQ </w:t>
       </w:r>
       <w:r>
         <w:rPr>
@@ -9428,15 +8886,7 @@
         <w:spacing w:before="100" w:beforeAutospacing="1" w:after="100" w:afterAutospacing="1" w:line="240" w:lineRule="auto"/>
       </w:pPr>
       <w:r>
-        <w:t xml:space="preserve">URL </w:t>
-      </w:r>
-      <w:proofErr w:type="spellStart"/>
-      <w:r>
-        <w:t>Shortener</w:t>
-      </w:r>
-      <w:proofErr w:type="spellEnd"/>
-      <w:r>
-        <w:t xml:space="preserve"> </w:t>
+        <w:t xml:space="preserve">URL Shortener </w:t>
       </w:r>
     </w:p>
     <w:p>
@@ -9504,8 +8954,8 @@
         <w:spacing w:after="0"/>
       </w:pPr>
       <w:r>
-        <w:pict>
-          <v:rect id="_x0000_i1051" style="width:0;height:1.5pt" o:hralign="center" o:hrstd="t" o:hr="t" fillcolor="#a0a0a0" stroked="f"/>
+        <w:pict w14:anchorId="59A9EA46">
+          <v:rect id="_x0000_i1041" style="width:0;height:1.5pt" o:hralign="center" o:hrstd="t" o:hr="t" fillcolor="#a0a0a0" stroked="f"/>
         </w:pict>
       </w:r>
     </w:p>
@@ -9573,13 +9023,8 @@
         </w:numPr>
         <w:spacing w:before="100" w:beforeAutospacing="1" w:after="100" w:afterAutospacing="1" w:line="240" w:lineRule="auto"/>
       </w:pPr>
-      <w:proofErr w:type="spellStart"/>
-      <w:r>
-        <w:t>HashMap</w:t>
-      </w:r>
-      <w:proofErr w:type="spellEnd"/>
-      <w:r>
-        <w:t xml:space="preserve"> </w:t>
+      <w:r>
+        <w:t xml:space="preserve">HashMap </w:t>
       </w:r>
     </w:p>
     <w:p>
@@ -9766,8 +9211,8 @@
     </w:p>
     <w:p>
       <w:r>
-        <w:pict>
-          <v:rect id="_x0000_i1052" style="width:0;height:1.5pt" o:hralign="center" o:hrstd="t" o:hr="t" fillcolor="#a0a0a0" stroked="f"/>
+        <w:pict w14:anchorId="668D5DFD">
+          <v:rect id="_x0000_i1042" style="width:0;height:1.5pt" o:hralign="center" o:hrstd="t" o:hr="t" fillcolor="#a0a0a0" stroked="f"/>
         </w:pict>
       </w:r>
     </w:p>
@@ -9874,15 +9319,7 @@
         <w:t>Week 5:</w:t>
       </w:r>
       <w:r>
-        <w:t xml:space="preserve"> Multithreading + </w:t>
-      </w:r>
-      <w:proofErr w:type="spellStart"/>
-      <w:r>
-        <w:t>RabbitMQ</w:t>
-      </w:r>
-      <w:proofErr w:type="spellEnd"/>
-      <w:r>
-        <w:t xml:space="preserve"> </w:t>
+        <w:t xml:space="preserve"> Multithreading + RabbitMQ </w:t>
       </w:r>
     </w:p>
     <w:p>
@@ -9908,8 +9345,8 @@
         <w:spacing w:after="0"/>
       </w:pPr>
       <w:r>
-        <w:pict>
-          <v:rect id="_x0000_i1053" style="width:0;height:1.5pt" o:hralign="center" o:hrstd="t" o:hr="t" fillcolor="#a0a0a0" stroked="f"/>
+        <w:pict w14:anchorId="585B9597">
+          <v:rect id="_x0000_i1043" style="width:0;height:1.5pt" o:hralign="center" o:hrstd="t" o:hr="t" fillcolor="#a0a0a0" stroked="f"/>
         </w:pict>
       </w:r>
     </w:p>
@@ -9949,13 +9386,8 @@
         </w:numPr>
         <w:spacing w:before="100" w:beforeAutospacing="1" w:after="100" w:afterAutospacing="1" w:line="240" w:lineRule="auto"/>
       </w:pPr>
-      <w:proofErr w:type="spellStart"/>
-      <w:r>
-        <w:t>HashMap</w:t>
-      </w:r>
-      <w:proofErr w:type="spellEnd"/>
-      <w:r>
-        <w:t xml:space="preserve"> Internal Working </w:t>
+      <w:r>
+        <w:t xml:space="preserve">HashMap Internal Working </w:t>
       </w:r>
     </w:p>
     <w:p>
@@ -10141,13 +9573,8 @@
         </w:numPr>
         <w:spacing w:before="100" w:beforeAutospacing="1" w:after="100" w:afterAutospacing="1" w:line="240" w:lineRule="auto"/>
       </w:pPr>
-      <w:proofErr w:type="spellStart"/>
-      <w:r>
-        <w:t>RabbitMQ</w:t>
-      </w:r>
-      <w:proofErr w:type="spellEnd"/>
-      <w:r>
-        <w:t xml:space="preserve"> Basics </w:t>
+      <w:r>
+        <w:t xml:space="preserve">RabbitMQ Basics </w:t>
       </w:r>
     </w:p>
     <w:p>
@@ -10183,12 +9610,7 @@
         <w:spacing w:before="100" w:beforeAutospacing="1" w:after="100" w:afterAutospacing="1" w:line="240" w:lineRule="auto"/>
       </w:pPr>
       <w:r>
-        <w:t>Basic System Design (Request Flow, Caching, Scaling)</w:t>
-      </w:r>
-      <w:bookmarkStart w:id="0" w:name="_GoBack"/>
-      <w:bookmarkEnd w:id="0"/>
-      <w:r>
-        <w:t xml:space="preserve"> </w:t>
+        <w:t xml:space="preserve">Basic System Design (Request Flow, Caching, Scaling) </w:t>
       </w:r>
     </w:p>
     <w:p>
@@ -10220,8 +9642,8 @@
 </file>
 
 <file path=word/numbering.xml><?xml version="1.0" encoding="utf-8"?>
-<w:numbering xmlns:wpc="http://schemas.microsoft.com/office/word/2010/wordprocessingCanvas" xmlns:mc="http://schemas.openxmlformats.org/markup-compatibility/2006" xmlns:o="urn:schemas-microsoft-com:office:office" xmlns:r="http://schemas.openxmlformats.org/officeDocument/2006/relationships" xmlns:m="http://schemas.openxmlformats.org/officeDocument/2006/math" xmlns:v="urn:schemas-microsoft-com:vml" xmlns:wp14="http://schemas.microsoft.com/office/word/2010/wordprocessingDrawing" xmlns:wp="http://schemas.openxmlformats.org/drawingml/2006/wordprocessingDrawing" xmlns:w10="urn:schemas-microsoft-com:office:word" xmlns:w="http://schemas.openxmlformats.org/wordprocessingml/2006/main" xmlns:w14="http://schemas.microsoft.com/office/word/2010/wordml" xmlns:w15="http://schemas.microsoft.com/office/word/2012/wordml" xmlns:wpg="http://schemas.microsoft.com/office/word/2010/wordprocessingGroup" xmlns:wpi="http://schemas.microsoft.com/office/word/2010/wordprocessingInk" xmlns:wne="http://schemas.microsoft.com/office/word/2006/wordml" xmlns:wps="http://schemas.microsoft.com/office/word/2010/wordprocessingShape" mc:Ignorable="w14 w15 wp14">
-  <w:abstractNum w:abstractNumId="0">
+<w:numbering xmlns:wpc="http://schemas.microsoft.com/office/word/2010/wordprocessingCanvas" xmlns:cx="http://schemas.microsoft.com/office/drawing/2014/chartex" xmlns:cx1="http://schemas.microsoft.com/office/drawing/2015/9/8/chartex" xmlns:cx2="http://schemas.microsoft.com/office/drawing/2015/10/21/chartex" xmlns:cx3="http://schemas.microsoft.com/office/drawing/2016/5/9/chartex" xmlns:cx4="http://schemas.microsoft.com/office/drawing/2016/5/10/chartex" xmlns:cx5="http://schemas.microsoft.com/office/drawing/2016/5/11/chartex" xmlns:cx6="http://schemas.microsoft.com/office/drawing/2016/5/12/chartex" xmlns:cx7="http://schemas.microsoft.com/office/drawing/2016/5/13/chartex" xmlns:cx8="http://schemas.microsoft.com/office/drawing/2016/5/14/chartex" xmlns:mc="http://schemas.openxmlformats.org/markup-compatibility/2006" xmlns:aink="http://schemas.microsoft.com/office/drawing/2016/ink" xmlns:am3d="http://schemas.microsoft.com/office/drawing/2017/model3d" xmlns:o="urn:schemas-microsoft-com:office:office" xmlns:r="http://schemas.openxmlformats.org/officeDocument/2006/relationships" xmlns:m="http://schemas.openxmlformats.org/officeDocument/2006/math" xmlns:v="urn:schemas-microsoft-com:vml" xmlns:wp14="http://schemas.microsoft.com/office/word/2010/wordprocessingDrawing" xmlns:wp="http://schemas.openxmlformats.org/drawingml/2006/wordprocessingDrawing" xmlns:w10="urn:schemas-microsoft-com:office:word" xmlns:w="http://schemas.openxmlformats.org/wordprocessingml/2006/main" xmlns:w14="http://schemas.microsoft.com/office/word/2010/wordml" xmlns:w15="http://schemas.microsoft.com/office/word/2012/wordml" xmlns:w16cex="http://schemas.microsoft.com/office/word/2018/wordml/cex" xmlns:w16cid="http://schemas.microsoft.com/office/word/2016/wordml/cid" xmlns:w16="http://schemas.microsoft.com/office/word/2018/wordml" xmlns:w16sdtdh="http://schemas.microsoft.com/office/word/2020/wordml/sdtdatahash" xmlns:w16se="http://schemas.microsoft.com/office/word/2015/wordml/symex" xmlns:wpg="http://schemas.microsoft.com/office/word/2010/wordprocessingGroup" xmlns:wpi="http://schemas.microsoft.com/office/word/2010/wordprocessingInk" xmlns:wne="http://schemas.microsoft.com/office/word/2006/wordml" xmlns:wps="http://schemas.microsoft.com/office/word/2010/wordprocessingShape" mc:Ignorable="w14 w15 w16se w16cid w16 w16cex w16sdtdh wp14">
+  <w:abstractNum w:abstractNumId="0" w15:restartNumberingAfterBreak="0">
     <w:nsid w:val="00196922"/>
     <w:multiLevelType w:val="multilevel"/>
     <w:tmpl w:val="171A88EC"/>
@@ -10370,7 +9792,7 @@
       </w:rPr>
     </w:lvl>
   </w:abstractNum>
-  <w:abstractNum w:abstractNumId="1">
+  <w:abstractNum w:abstractNumId="1" w15:restartNumberingAfterBreak="0">
     <w:nsid w:val="01106089"/>
     <w:multiLevelType w:val="multilevel"/>
     <w:tmpl w:val="60E6D8C4"/>
@@ -10519,7 +9941,7 @@
       </w:rPr>
     </w:lvl>
   </w:abstractNum>
-  <w:abstractNum w:abstractNumId="2">
+  <w:abstractNum w:abstractNumId="2" w15:restartNumberingAfterBreak="0">
     <w:nsid w:val="018A3AC5"/>
     <w:multiLevelType w:val="multilevel"/>
     <w:tmpl w:val="AB8E08E8"/>
@@ -10668,7 +10090,7 @@
       </w:rPr>
     </w:lvl>
   </w:abstractNum>
-  <w:abstractNum w:abstractNumId="3">
+  <w:abstractNum w:abstractNumId="3" w15:restartNumberingAfterBreak="0">
     <w:nsid w:val="019A2ED7"/>
     <w:multiLevelType w:val="multilevel"/>
     <w:tmpl w:val="436E5FBA"/>
@@ -10817,7 +10239,7 @@
       </w:rPr>
     </w:lvl>
   </w:abstractNum>
-  <w:abstractNum w:abstractNumId="4">
+  <w:abstractNum w:abstractNumId="4" w15:restartNumberingAfterBreak="0">
     <w:nsid w:val="02034AF6"/>
     <w:multiLevelType w:val="multilevel"/>
     <w:tmpl w:val="E5A0EEE2"/>
@@ -10966,7 +10388,7 @@
       </w:rPr>
     </w:lvl>
   </w:abstractNum>
-  <w:abstractNum w:abstractNumId="5">
+  <w:abstractNum w:abstractNumId="5" w15:restartNumberingAfterBreak="0">
     <w:nsid w:val="04E60B03"/>
     <w:multiLevelType w:val="multilevel"/>
     <w:tmpl w:val="53BA9E50"/>
@@ -11115,7 +10537,7 @@
       </w:rPr>
     </w:lvl>
   </w:abstractNum>
-  <w:abstractNum w:abstractNumId="6">
+  <w:abstractNum w:abstractNumId="6" w15:restartNumberingAfterBreak="0">
     <w:nsid w:val="06A64E5F"/>
     <w:multiLevelType w:val="multilevel"/>
     <w:tmpl w:val="A874F3FC"/>
@@ -11264,7 +10686,7 @@
       </w:rPr>
     </w:lvl>
   </w:abstractNum>
-  <w:abstractNum w:abstractNumId="7">
+  <w:abstractNum w:abstractNumId="7" w15:restartNumberingAfterBreak="0">
     <w:nsid w:val="0A2853E5"/>
     <w:multiLevelType w:val="multilevel"/>
     <w:tmpl w:val="8FE4ABE6"/>
@@ -11413,7 +10835,7 @@
       </w:rPr>
     </w:lvl>
   </w:abstractNum>
-  <w:abstractNum w:abstractNumId="8">
+  <w:abstractNum w:abstractNumId="8" w15:restartNumberingAfterBreak="0">
     <w:nsid w:val="0AAB768A"/>
     <w:multiLevelType w:val="multilevel"/>
     <w:tmpl w:val="DEDE8A20"/>
@@ -11562,7 +10984,7 @@
       </w:rPr>
     </w:lvl>
   </w:abstractNum>
-  <w:abstractNum w:abstractNumId="9">
+  <w:abstractNum w:abstractNumId="9" w15:restartNumberingAfterBreak="0">
     <w:nsid w:val="120D2C84"/>
     <w:multiLevelType w:val="multilevel"/>
     <w:tmpl w:val="0F00E312"/>
@@ -11711,7 +11133,7 @@
       </w:rPr>
     </w:lvl>
   </w:abstractNum>
-  <w:abstractNum w:abstractNumId="10">
+  <w:abstractNum w:abstractNumId="10" w15:restartNumberingAfterBreak="0">
     <w:nsid w:val="12B147EA"/>
     <w:multiLevelType w:val="multilevel"/>
     <w:tmpl w:val="5902F318"/>
@@ -11860,7 +11282,7 @@
       </w:rPr>
     </w:lvl>
   </w:abstractNum>
-  <w:abstractNum w:abstractNumId="11">
+  <w:abstractNum w:abstractNumId="11" w15:restartNumberingAfterBreak="0">
     <w:nsid w:val="19A62903"/>
     <w:multiLevelType w:val="multilevel"/>
     <w:tmpl w:val="14F8E3E0"/>
@@ -12009,7 +11431,7 @@
       </w:rPr>
     </w:lvl>
   </w:abstractNum>
-  <w:abstractNum w:abstractNumId="12">
+  <w:abstractNum w:abstractNumId="12" w15:restartNumberingAfterBreak="0">
     <w:nsid w:val="24DB0DBE"/>
     <w:multiLevelType w:val="multilevel"/>
     <w:tmpl w:val="DE6A20E0"/>
@@ -12158,7 +11580,7 @@
       </w:rPr>
     </w:lvl>
   </w:abstractNum>
-  <w:abstractNum w:abstractNumId="13">
+  <w:abstractNum w:abstractNumId="13" w15:restartNumberingAfterBreak="0">
     <w:nsid w:val="24E06FB9"/>
     <w:multiLevelType w:val="multilevel"/>
     <w:tmpl w:val="D65C405E"/>
@@ -12307,7 +11729,7 @@
       </w:rPr>
     </w:lvl>
   </w:abstractNum>
-  <w:abstractNum w:abstractNumId="14">
+  <w:abstractNum w:abstractNumId="14" w15:restartNumberingAfterBreak="0">
     <w:nsid w:val="2D7B12C1"/>
     <w:multiLevelType w:val="multilevel"/>
     <w:tmpl w:val="51E65E56"/>
@@ -12456,7 +11878,7 @@
       </w:rPr>
     </w:lvl>
   </w:abstractNum>
-  <w:abstractNum w:abstractNumId="15">
+  <w:abstractNum w:abstractNumId="15" w15:restartNumberingAfterBreak="0">
     <w:nsid w:val="327B5478"/>
     <w:multiLevelType w:val="multilevel"/>
     <w:tmpl w:val="A064CE26"/>
@@ -12605,7 +12027,7 @@
       </w:rPr>
     </w:lvl>
   </w:abstractNum>
-  <w:abstractNum w:abstractNumId="16">
+  <w:abstractNum w:abstractNumId="16" w15:restartNumberingAfterBreak="0">
     <w:nsid w:val="330E6F1F"/>
     <w:multiLevelType w:val="multilevel"/>
     <w:tmpl w:val="97F07328"/>
@@ -12754,7 +12176,7 @@
       </w:rPr>
     </w:lvl>
   </w:abstractNum>
-  <w:abstractNum w:abstractNumId="17">
+  <w:abstractNum w:abstractNumId="17" w15:restartNumberingAfterBreak="0">
     <w:nsid w:val="35583EF7"/>
     <w:multiLevelType w:val="multilevel"/>
     <w:tmpl w:val="739EE2F2"/>
@@ -12903,7 +12325,7 @@
       </w:rPr>
     </w:lvl>
   </w:abstractNum>
-  <w:abstractNum w:abstractNumId="18">
+  <w:abstractNum w:abstractNumId="18" w15:restartNumberingAfterBreak="0">
     <w:nsid w:val="364711A1"/>
     <w:multiLevelType w:val="multilevel"/>
     <w:tmpl w:val="033433A6"/>
@@ -13052,7 +12474,7 @@
       </w:rPr>
     </w:lvl>
   </w:abstractNum>
-  <w:abstractNum w:abstractNumId="19">
+  <w:abstractNum w:abstractNumId="19" w15:restartNumberingAfterBreak="0">
     <w:nsid w:val="379467ED"/>
     <w:multiLevelType w:val="multilevel"/>
     <w:tmpl w:val="7474F3C8"/>
@@ -13165,7 +12587,7 @@
       </w:pPr>
     </w:lvl>
   </w:abstractNum>
-  <w:abstractNum w:abstractNumId="20">
+  <w:abstractNum w:abstractNumId="20" w15:restartNumberingAfterBreak="0">
     <w:nsid w:val="3E7C685D"/>
     <w:multiLevelType w:val="multilevel"/>
     <w:tmpl w:val="102A9CE2"/>
@@ -13314,7 +12736,7 @@
       </w:rPr>
     </w:lvl>
   </w:abstractNum>
-  <w:abstractNum w:abstractNumId="21">
+  <w:abstractNum w:abstractNumId="21" w15:restartNumberingAfterBreak="0">
     <w:nsid w:val="45E05B99"/>
     <w:multiLevelType w:val="multilevel"/>
     <w:tmpl w:val="A7087A18"/>
@@ -13463,7 +12885,7 @@
       </w:rPr>
     </w:lvl>
   </w:abstractNum>
-  <w:abstractNum w:abstractNumId="22">
+  <w:abstractNum w:abstractNumId="22" w15:restartNumberingAfterBreak="0">
     <w:nsid w:val="4761217F"/>
     <w:multiLevelType w:val="multilevel"/>
     <w:tmpl w:val="687CDF4C"/>
@@ -13612,7 +13034,7 @@
       </w:rPr>
     </w:lvl>
   </w:abstractNum>
-  <w:abstractNum w:abstractNumId="23">
+  <w:abstractNum w:abstractNumId="23" w15:restartNumberingAfterBreak="0">
     <w:nsid w:val="486C2D4E"/>
     <w:multiLevelType w:val="multilevel"/>
     <w:tmpl w:val="8E4A54F6"/>
@@ -13761,7 +13183,7 @@
       </w:rPr>
     </w:lvl>
   </w:abstractNum>
-  <w:abstractNum w:abstractNumId="24">
+  <w:abstractNum w:abstractNumId="24" w15:restartNumberingAfterBreak="0">
     <w:nsid w:val="4B025192"/>
     <w:multiLevelType w:val="multilevel"/>
     <w:tmpl w:val="14F670EC"/>
@@ -13910,7 +13332,7 @@
       </w:rPr>
     </w:lvl>
   </w:abstractNum>
-  <w:abstractNum w:abstractNumId="25">
+  <w:abstractNum w:abstractNumId="25" w15:restartNumberingAfterBreak="0">
     <w:nsid w:val="4B682417"/>
     <w:multiLevelType w:val="multilevel"/>
     <w:tmpl w:val="8446E2F8"/>
@@ -14059,7 +13481,7 @@
       </w:rPr>
     </w:lvl>
   </w:abstractNum>
-  <w:abstractNum w:abstractNumId="26">
+  <w:abstractNum w:abstractNumId="26" w15:restartNumberingAfterBreak="0">
     <w:nsid w:val="4E710A12"/>
     <w:multiLevelType w:val="multilevel"/>
     <w:tmpl w:val="18AE12A0"/>
@@ -14172,7 +13594,7 @@
       </w:pPr>
     </w:lvl>
   </w:abstractNum>
-  <w:abstractNum w:abstractNumId="27">
+  <w:abstractNum w:abstractNumId="27" w15:restartNumberingAfterBreak="0">
     <w:nsid w:val="4E8047AA"/>
     <w:multiLevelType w:val="multilevel"/>
     <w:tmpl w:val="0254991E"/>
@@ -14321,7 +13743,7 @@
       </w:rPr>
     </w:lvl>
   </w:abstractNum>
-  <w:abstractNum w:abstractNumId="28">
+  <w:abstractNum w:abstractNumId="28" w15:restartNumberingAfterBreak="0">
     <w:nsid w:val="502E37D3"/>
     <w:multiLevelType w:val="multilevel"/>
     <w:tmpl w:val="931C381E"/>
@@ -14470,7 +13892,7 @@
       </w:rPr>
     </w:lvl>
   </w:abstractNum>
-  <w:abstractNum w:abstractNumId="29">
+  <w:abstractNum w:abstractNumId="29" w15:restartNumberingAfterBreak="0">
     <w:nsid w:val="55FA21F8"/>
     <w:multiLevelType w:val="multilevel"/>
     <w:tmpl w:val="D33E9B8E"/>
@@ -14619,7 +14041,7 @@
       </w:rPr>
     </w:lvl>
   </w:abstractNum>
-  <w:abstractNum w:abstractNumId="30">
+  <w:abstractNum w:abstractNumId="30" w15:restartNumberingAfterBreak="0">
     <w:nsid w:val="5B910FEA"/>
     <w:multiLevelType w:val="multilevel"/>
     <w:tmpl w:val="673CDED8"/>
@@ -14768,7 +14190,7 @@
       </w:rPr>
     </w:lvl>
   </w:abstractNum>
-  <w:abstractNum w:abstractNumId="31">
+  <w:abstractNum w:abstractNumId="31" w15:restartNumberingAfterBreak="0">
     <w:nsid w:val="5C09075E"/>
     <w:multiLevelType w:val="multilevel"/>
     <w:tmpl w:val="A5E02EAA"/>
@@ -14917,7 +14339,7 @@
       </w:rPr>
     </w:lvl>
   </w:abstractNum>
-  <w:abstractNum w:abstractNumId="32">
+  <w:abstractNum w:abstractNumId="32" w15:restartNumberingAfterBreak="0">
     <w:nsid w:val="5EC74A9C"/>
     <w:multiLevelType w:val="multilevel"/>
     <w:tmpl w:val="0DD61DD2"/>
@@ -15066,7 +14488,7 @@
       </w:rPr>
     </w:lvl>
   </w:abstractNum>
-  <w:abstractNum w:abstractNumId="33">
+  <w:abstractNum w:abstractNumId="33" w15:restartNumberingAfterBreak="0">
     <w:nsid w:val="5F8A6C9B"/>
     <w:multiLevelType w:val="multilevel"/>
     <w:tmpl w:val="7700AC0C"/>
@@ -15215,7 +14637,7 @@
       </w:rPr>
     </w:lvl>
   </w:abstractNum>
-  <w:abstractNum w:abstractNumId="34">
+  <w:abstractNum w:abstractNumId="34" w15:restartNumberingAfterBreak="0">
     <w:nsid w:val="60CA6593"/>
     <w:multiLevelType w:val="multilevel"/>
     <w:tmpl w:val="F6C45740"/>
@@ -15364,7 +14786,7 @@
       </w:rPr>
     </w:lvl>
   </w:abstractNum>
-  <w:abstractNum w:abstractNumId="35">
+  <w:abstractNum w:abstractNumId="35" w15:restartNumberingAfterBreak="0">
     <w:nsid w:val="6AE3539F"/>
     <w:multiLevelType w:val="multilevel"/>
     <w:tmpl w:val="77C061B6"/>
@@ -15513,7 +14935,7 @@
       </w:rPr>
     </w:lvl>
   </w:abstractNum>
-  <w:abstractNum w:abstractNumId="36">
+  <w:abstractNum w:abstractNumId="36" w15:restartNumberingAfterBreak="0">
     <w:nsid w:val="6AE65A66"/>
     <w:multiLevelType w:val="multilevel"/>
     <w:tmpl w:val="70D654C0"/>
@@ -15662,7 +15084,7 @@
       </w:rPr>
     </w:lvl>
   </w:abstractNum>
-  <w:abstractNum w:abstractNumId="37">
+  <w:abstractNum w:abstractNumId="37" w15:restartNumberingAfterBreak="0">
     <w:nsid w:val="7072098F"/>
     <w:multiLevelType w:val="multilevel"/>
     <w:tmpl w:val="B1F8E3B8"/>
@@ -15811,7 +15233,7 @@
       </w:rPr>
     </w:lvl>
   </w:abstractNum>
-  <w:abstractNum w:abstractNumId="38">
+  <w:abstractNum w:abstractNumId="38" w15:restartNumberingAfterBreak="0">
     <w:nsid w:val="72B300A8"/>
     <w:multiLevelType w:val="multilevel"/>
     <w:tmpl w:val="9DD0D758"/>
@@ -15960,7 +15382,7 @@
       </w:rPr>
     </w:lvl>
   </w:abstractNum>
-  <w:abstractNum w:abstractNumId="39">
+  <w:abstractNum w:abstractNumId="39" w15:restartNumberingAfterBreak="0">
     <w:nsid w:val="73B53EE6"/>
     <w:multiLevelType w:val="multilevel"/>
     <w:tmpl w:val="68D0704E"/>
@@ -16109,7 +15531,7 @@
       </w:rPr>
     </w:lvl>
   </w:abstractNum>
-  <w:abstractNum w:abstractNumId="40">
+  <w:abstractNum w:abstractNumId="40" w15:restartNumberingAfterBreak="0">
     <w:nsid w:val="75FC2719"/>
     <w:multiLevelType w:val="multilevel"/>
     <w:tmpl w:val="5316E132"/>
@@ -16258,7 +15680,7 @@
       </w:rPr>
     </w:lvl>
   </w:abstractNum>
-  <w:abstractNum w:abstractNumId="41">
+  <w:abstractNum w:abstractNumId="41" w15:restartNumberingAfterBreak="0">
     <w:nsid w:val="788B4DF5"/>
     <w:multiLevelType w:val="multilevel"/>
     <w:tmpl w:val="032ACF8E"/>
@@ -16407,7 +15829,7 @@
       </w:rPr>
     </w:lvl>
   </w:abstractNum>
-  <w:abstractNum w:abstractNumId="42">
+  <w:abstractNum w:abstractNumId="42" w15:restartNumberingAfterBreak="0">
     <w:nsid w:val="79906683"/>
     <w:multiLevelType w:val="multilevel"/>
     <w:tmpl w:val="0C3EF42C"/>
@@ -16556,7 +15978,7 @@
       </w:rPr>
     </w:lvl>
   </w:abstractNum>
-  <w:abstractNum w:abstractNumId="43">
+  <w:abstractNum w:abstractNumId="43" w15:restartNumberingAfterBreak="0">
     <w:nsid w:val="7BEF5A9A"/>
     <w:multiLevelType w:val="multilevel"/>
     <w:tmpl w:val="2FFEA62A"/>
@@ -16705,7 +16127,7 @@
       </w:rPr>
     </w:lvl>
   </w:abstractNum>
-  <w:abstractNum w:abstractNumId="44">
+  <w:abstractNum w:abstractNumId="44" w15:restartNumberingAfterBreak="0">
     <w:nsid w:val="7C5A4F15"/>
     <w:multiLevelType w:val="multilevel"/>
     <w:tmpl w:val="24C2AC5A"/>
@@ -16854,7 +16276,7 @@
       </w:rPr>
     </w:lvl>
   </w:abstractNum>
-  <w:abstractNum w:abstractNumId="45">
+  <w:abstractNum w:abstractNumId="45" w15:restartNumberingAfterBreak="0">
     <w:nsid w:val="7F884C8D"/>
     <w:multiLevelType w:val="multilevel"/>
     <w:tmpl w:val="FEBC2BE8"/>
@@ -17145,7 +16567,7 @@
 </file>
 
 <file path=word/styles.xml><?xml version="1.0" encoding="utf-8"?>
-<w:styles xmlns:mc="http://schemas.openxmlformats.org/markup-compatibility/2006" xmlns:r="http://schemas.openxmlformats.org/officeDocument/2006/relationships" xmlns:w="http://schemas.openxmlformats.org/wordprocessingml/2006/main" xmlns:w14="http://schemas.microsoft.com/office/word/2010/wordml" xmlns:w15="http://schemas.microsoft.com/office/word/2012/wordml" mc:Ignorable="w14 w15">
+<w:styles xmlns:mc="http://schemas.openxmlformats.org/markup-compatibility/2006" xmlns:r="http://schemas.openxmlformats.org/officeDocument/2006/relationships" xmlns:w="http://schemas.openxmlformats.org/wordprocessingml/2006/main" xmlns:w14="http://schemas.microsoft.com/office/word/2010/wordml" xmlns:w15="http://schemas.microsoft.com/office/word/2012/wordml" xmlns:w16cex="http://schemas.microsoft.com/office/word/2018/wordml/cex" xmlns:w16cid="http://schemas.microsoft.com/office/word/2016/wordml/cid" xmlns:w16="http://schemas.microsoft.com/office/word/2018/wordml" xmlns:w16sdtdh="http://schemas.microsoft.com/office/word/2020/wordml/sdtdatahash" xmlns:w16se="http://schemas.microsoft.com/office/word/2015/wordml/symex" mc:Ignorable="w14 w15 w16se w16cid w16 w16cex w16sdtdh">
   <w:docDefaults>
     <w:rPrDefault>
       <w:rPr>
@@ -17161,7 +16583,7 @@
       </w:pPr>
     </w:pPrDefault>
   </w:docDefaults>
-  <w:latentStyles w:defLockedState="0" w:defUIPriority="99" w:defSemiHidden="0" w:defUnhideWhenUsed="0" w:defQFormat="0" w:count="371">
+  <w:latentStyles w:defLockedState="0" w:defUIPriority="99" w:defSemiHidden="0" w:defUnhideWhenUsed="0" w:defQFormat="0" w:count="376">
     <w:lsdException w:name="Normal" w:uiPriority="0" w:qFormat="1"/>
     <w:lsdException w:name="heading 1" w:uiPriority="9" w:qFormat="1"/>
     <w:lsdException w:name="heading 2" w:semiHidden="1" w:uiPriority="9" w:unhideWhenUsed="1" w:qFormat="1"/>
@@ -17267,7 +16689,6 @@
     <w:lsdException w:name="HTML Sample" w:semiHidden="1" w:unhideWhenUsed="1"/>
     <w:lsdException w:name="HTML Typewriter" w:semiHidden="1" w:unhideWhenUsed="1"/>
     <w:lsdException w:name="HTML Variable" w:semiHidden="1" w:unhideWhenUsed="1"/>
-    <w:lsdException w:name="Normal Table" w:semiHidden="1" w:unhideWhenUsed="1"/>
     <w:lsdException w:name="annotation subject" w:semiHidden="1" w:unhideWhenUsed="1"/>
     <w:lsdException w:name="No List" w:semiHidden="1" w:unhideWhenUsed="1"/>
     <w:lsdException w:name="Outline List 1" w:semiHidden="1" w:unhideWhenUsed="1"/>
@@ -17310,11 +16731,8 @@
     <w:lsdException w:name="Table Contemporary" w:semiHidden="1" w:unhideWhenUsed="1"/>
     <w:lsdException w:name="Table Elegant" w:semiHidden="1" w:unhideWhenUsed="1"/>
     <w:lsdException w:name="Table Professional" w:semiHidden="1" w:unhideWhenUsed="1"/>
-    <w:lsdException w:name="Table Subtle 1" w:semiHidden="1" w:unhideWhenUsed="1"/>
     <w:lsdException w:name="Table Subtle 2" w:semiHidden="1" w:unhideWhenUsed="1"/>
     <w:lsdException w:name="Table Web 1" w:semiHidden="1" w:unhideWhenUsed="1"/>
-    <w:lsdException w:name="Table Web 2" w:semiHidden="1" w:unhideWhenUsed="1"/>
-    <w:lsdException w:name="Table Web 3" w:semiHidden="1" w:unhideWhenUsed="1"/>
     <w:lsdException w:name="Balloon Text" w:semiHidden="1" w:unhideWhenUsed="1"/>
     <w:lsdException w:name="Table Grid" w:uiPriority="39"/>
     <w:lsdException w:name="Table Theme" w:semiHidden="1" w:unhideWhenUsed="1"/>
@@ -17533,6 +16951,11 @@
     <w:lsdException w:name="List Table 5 Dark Accent 6" w:uiPriority="50"/>
     <w:lsdException w:name="List Table 6 Colorful Accent 6" w:uiPriority="51"/>
     <w:lsdException w:name="List Table 7 Colorful Accent 6" w:uiPriority="52"/>
+    <w:lsdException w:name="Mention" w:semiHidden="1" w:unhideWhenUsed="1"/>
+    <w:lsdException w:name="Smart Hyperlink" w:semiHidden="1" w:unhideWhenUsed="1"/>
+    <w:lsdException w:name="Hashtag" w:semiHidden="1" w:unhideWhenUsed="1"/>
+    <w:lsdException w:name="Unresolved Mention" w:semiHidden="1" w:unhideWhenUsed="1"/>
+    <w:lsdException w:name="Smart Link" w:semiHidden="1" w:unhideWhenUsed="1"/>
   </w:latentStyles>
   <w:style w:type="paragraph" w:default="1" w:styleId="Normal">
     <w:name w:val="Normal"/>

</xml_diff>